<commit_message>
Prepare jury v3 presentation, video, documentation and verification
</commit_message>
<xml_diff>
--- a/docs/delivery/gost/api-guide.docx
+++ b/docs/delivery/gost/api-guide.docx
@@ -110,7 +110,7 @@
           <w:color w:val="000000"/>
           <w:u w:val="none"/>
         </w:rPr>
-        <w:t xml:space="preserve">, сверка 9 октября 2026. Рабочая копия NAS: </w:t>
+        <w:t xml:space="preserve">, сверка 11 октября 2026. Рабочая копия NAS: </w:t>
       </w:r>
       <w:r>
         <w:rPr>
@@ -135,7 +135,7 @@
           <w:color w:val="000000"/>
           <w:u w:val="none"/>
         </w:rPr>
-        <w:t>87 путей и 100 операций</w:t>
+        <w:t>88 путей и 101 операция</w:t>
       </w:r>
       <w:r>
         <w:rPr>
@@ -985,7 +985,7 @@
           <w:color w:val="000000"/>
           <w:u w:val="none"/>
         </w:rPr>
-        <w:t>3. Регистрация и профиль</w:t>
+        <w:t>3. Индивидуальный вход на стенд жюри</w:t>
       </w:r>
     </w:p>
     <w:p>
@@ -995,15 +995,231 @@
           <w:color w:val="000000"/>
           <w:u w:val="none"/>
         </w:rPr>
-        <w:t>POST /api/v1/auth/register</w:t>
-      </w:r>
-      <w:r>
-        <w:rPr>
-          <w:rFonts w:ascii="Times New Roman" w:hAnsi="Times New Roman" w:eastAsia="Times New Roman" w:cs="Times New Roman"/>
-          <w:color w:val="000000"/>
-          <w:u w:val="none"/>
-        </w:rPr>
-        <w:t xml:space="preserve"> принимает </w:t>
+        <w:t xml:space="preserve">Только при </w:t>
+      </w:r>
+      <w:r>
+        <w:rPr>
+          <w:rFonts w:ascii="Times New Roman" w:hAnsi="Times New Roman" w:eastAsia="Times New Roman" w:cs="Times New Roman"/>
+          <w:color w:val="000000"/>
+          <w:u w:val="none"/>
+        </w:rPr>
+        <w:t>FSP_JURY_MODE=1</w:t>
+      </w:r>
+      <w:r>
+        <w:rPr>
+          <w:rFonts w:ascii="Times New Roman" w:hAnsi="Times New Roman" w:eastAsia="Times New Roman" w:cs="Times New Roman"/>
+          <w:color w:val="000000"/>
+          <w:u w:val="none"/>
+        </w:rPr>
+        <w:t xml:space="preserve"> и </w:t>
+      </w:r>
+      <w:r>
+        <w:rPr>
+          <w:rFonts w:ascii="Times New Roman" w:hAnsi="Times New Roman" w:eastAsia="Times New Roman" w:cs="Times New Roman"/>
+          <w:color w:val="000000"/>
+          <w:u w:val="none"/>
+        </w:rPr>
+        <w:t>FSP_JURY_INDIVIDUAL_REGISTRATION=1</w:t>
+      </w:r>
+      <w:r>
+        <w:rPr>
+          <w:rFonts w:ascii="Times New Roman" w:hAnsi="Times New Roman" w:eastAsia="Times New Roman" w:cs="Times New Roman"/>
+          <w:color w:val="000000"/>
+          <w:u w:val="none"/>
+        </w:rPr>
+        <w:t xml:space="preserve"> доступен </w:t>
+      </w:r>
+      <w:r>
+        <w:rPr>
+          <w:rFonts w:ascii="Times New Roman" w:hAnsi="Times New Roman" w:eastAsia="Times New Roman" w:cs="Times New Roman"/>
+          <w:color w:val="000000"/>
+          <w:u w:val="none"/>
+        </w:rPr>
+        <w:t>POST /auth/jury-register</w:t>
+      </w:r>
+      <w:r>
+        <w:rPr>
+          <w:rFonts w:ascii="Times New Roman" w:hAnsi="Times New Roman" w:eastAsia="Times New Roman" w:cs="Times New Roman"/>
+          <w:color w:val="000000"/>
+          <w:u w:val="none"/>
+        </w:rPr>
+        <w:t xml:space="preserve">. Тело </w:t>
+      </w:r>
+      <w:r>
+        <w:rPr>
+          <w:rFonts w:ascii="Times New Roman" w:hAnsi="Times New Roman" w:eastAsia="Times New Roman" w:cs="Times New Roman"/>
+          <w:color w:val="000000"/>
+          <w:u w:val="none"/>
+        </w:rPr>
+        <w:t>JuryRegister</w:t>
+      </w:r>
+      <w:r>
+        <w:rPr>
+          <w:rFonts w:ascii="Times New Roman" w:hAnsi="Times New Roman" w:eastAsia="Times New Roman" w:cs="Times New Roman"/>
+          <w:color w:val="000000"/>
+          <w:u w:val="none"/>
+        </w:rPr>
+        <w:t xml:space="preserve"> содержит </w:t>
+      </w:r>
+      <w:r>
+        <w:rPr>
+          <w:rFonts w:ascii="Times New Roman" w:hAnsi="Times New Roman" w:eastAsia="Times New Roman" w:cs="Times New Roman"/>
+          <w:color w:val="000000"/>
+          <w:u w:val="none"/>
+        </w:rPr>
+        <w:t>role</w:t>
+      </w:r>
+      <w:r>
+        <w:rPr>
+          <w:rFonts w:ascii="Times New Roman" w:hAnsi="Times New Roman" w:eastAsia="Times New Roman" w:cs="Times New Roman"/>
+          <w:color w:val="000000"/>
+          <w:u w:val="none"/>
+        </w:rPr>
+        <w:t xml:space="preserve"> (</w:t>
+      </w:r>
+      <w:r>
+        <w:rPr>
+          <w:rFonts w:ascii="Times New Roman" w:hAnsi="Times New Roman" w:eastAsia="Times New Roman" w:cs="Times New Roman"/>
+          <w:color w:val="000000"/>
+          <w:u w:val="none"/>
+        </w:rPr>
+        <w:t>candidate</w:t>
+      </w:r>
+      <w:r>
+        <w:rPr>
+          <w:rFonts w:ascii="Times New Roman" w:hAnsi="Times New Roman" w:eastAsia="Times New Roman" w:cs="Times New Roman"/>
+          <w:color w:val="000000"/>
+          <w:u w:val="none"/>
+        </w:rPr>
+        <w:t xml:space="preserve"> или </w:t>
+      </w:r>
+      <w:r>
+        <w:rPr>
+          <w:rFonts w:ascii="Times New Roman" w:hAnsi="Times New Roman" w:eastAsia="Times New Roman" w:cs="Times New Roman"/>
+          <w:color w:val="000000"/>
+          <w:u w:val="none"/>
+        </w:rPr>
+        <w:t>employer</w:t>
+      </w:r>
+      <w:r>
+        <w:rPr>
+          <w:rFonts w:ascii="Times New Roman" w:hAnsi="Times New Roman" w:eastAsia="Times New Roman" w:cs="Times New Roman"/>
+          <w:color w:val="000000"/>
+          <w:u w:val="none"/>
+        </w:rPr>
+        <w:t xml:space="preserve">), </w:t>
+      </w:r>
+      <w:r>
+        <w:rPr>
+          <w:rFonts w:ascii="Times New Roman" w:hAnsi="Times New Roman" w:eastAsia="Times New Roman" w:cs="Times New Roman"/>
+          <w:color w:val="000000"/>
+          <w:u w:val="none"/>
+        </w:rPr>
+        <w:t>password</w:t>
+      </w:r>
+      <w:r>
+        <w:rPr>
+          <w:rFonts w:ascii="Times New Roman" w:hAnsi="Times New Roman" w:eastAsia="Times New Roman" w:cs="Times New Roman"/>
+          <w:color w:val="000000"/>
+          <w:u w:val="none"/>
+        </w:rPr>
+        <w:t xml:space="preserve"> от 12 до 128 символов и </w:t>
+      </w:r>
+      <w:r>
+        <w:rPr>
+          <w:rFonts w:ascii="Times New Roman" w:hAnsi="Times New Roman" w:eastAsia="Times New Roman" w:cs="Times New Roman"/>
+          <w:color w:val="000000"/>
+          <w:u w:val="none"/>
+        </w:rPr>
+        <w:t>consent: true</w:t>
+      </w:r>
+      <w:r>
+        <w:rPr>
+          <w:rFonts w:ascii="Times New Roman" w:hAnsi="Times New Roman" w:eastAsia="Times New Roman" w:cs="Times New Roman"/>
+          <w:color w:val="000000"/>
+          <w:u w:val="none"/>
+        </w:rPr>
+        <w:t xml:space="preserve">. Другие поля, включая настоящую почту и имя, отклоняются. Сервер создаёт синтетический логин </w:t>
+      </w:r>
+      <w:r>
+        <w:rPr>
+          <w:rFonts w:ascii="Times New Roman" w:hAnsi="Times New Roman" w:eastAsia="Times New Roman" w:cs="Times New Roman"/>
+          <w:color w:val="000000"/>
+          <w:u w:val="none"/>
+        </w:rPr>
+        <w:t>jury-…@example.invalid</w:t>
+      </w:r>
+      <w:r>
+        <w:rPr>
+          <w:rFonts w:ascii="Times New Roman" w:hAnsi="Times New Roman" w:eastAsia="Times New Roman" w:cs="Times New Roman"/>
+          <w:color w:val="000000"/>
+          <w:u w:val="none"/>
+        </w:rPr>
+        <w:t xml:space="preserve">, профиль или компанию и сразу возвращает </w:t>
+      </w:r>
+      <w:r>
+        <w:rPr>
+          <w:rFonts w:ascii="Times New Roman" w:hAnsi="Times New Roman" w:eastAsia="Times New Roman" w:cs="Times New Roman"/>
+          <w:color w:val="000000"/>
+          <w:u w:val="none"/>
+        </w:rPr>
+        <w:t>JurySession</w:t>
+      </w:r>
+      <w:r>
+        <w:rPr>
+          <w:rFonts w:ascii="Times New Roman" w:hAnsi="Times New Roman" w:eastAsia="Times New Roman" w:cs="Times New Roman"/>
+          <w:color w:val="000000"/>
+          <w:u w:val="none"/>
+        </w:rPr>
+        <w:t xml:space="preserve"> со статусом 201: </w:t>
+      </w:r>
+      <w:r>
+        <w:rPr>
+          <w:rFonts w:ascii="Times New Roman" w:hAnsi="Times New Roman" w:eastAsia="Times New Roman" w:cs="Times New Roman"/>
+          <w:color w:val="000000"/>
+          <w:u w:val="none"/>
+        </w:rPr>
+        <w:t>id</w:t>
+      </w:r>
+      <w:r>
+        <w:rPr>
+          <w:rFonts w:ascii="Times New Roman" w:hAnsi="Times New Roman" w:eastAsia="Times New Roman" w:cs="Times New Roman"/>
+          <w:color w:val="000000"/>
+          <w:u w:val="none"/>
+        </w:rPr>
+        <w:t xml:space="preserve">, </w:t>
+      </w:r>
+      <w:r>
+        <w:rPr>
+          <w:rFonts w:ascii="Times New Roman" w:hAnsi="Times New Roman" w:eastAsia="Times New Roman" w:cs="Times New Roman"/>
+          <w:color w:val="000000"/>
+          <w:u w:val="none"/>
+        </w:rPr>
+        <w:t>role</w:t>
+      </w:r>
+      <w:r>
+        <w:rPr>
+          <w:rFonts w:ascii="Times New Roman" w:hAnsi="Times New Roman" w:eastAsia="Times New Roman" w:cs="Times New Roman"/>
+          <w:color w:val="000000"/>
+          <w:u w:val="none"/>
+        </w:rPr>
+        <w:t xml:space="preserve">, </w:t>
+      </w:r>
+      <w:r>
+        <w:rPr>
+          <w:rFonts w:ascii="Times New Roman" w:hAnsi="Times New Roman" w:eastAsia="Times New Roman" w:cs="Times New Roman"/>
+          <w:color w:val="000000"/>
+          <w:u w:val="none"/>
+        </w:rPr>
+        <w:t>label</w:t>
+      </w:r>
+      <w:r>
+        <w:rPr>
+          <w:rFonts w:ascii="Times New Roman" w:hAnsi="Times New Roman" w:eastAsia="Times New Roman" w:cs="Times New Roman"/>
+          <w:color w:val="000000"/>
+          <w:u w:val="none"/>
+        </w:rPr>
+        <w:t xml:space="preserve">, </w:t>
       </w:r>
       <w:r>
         <w:rPr>
@@ -1027,7 +1243,7 @@
           <w:color w:val="000000"/>
           <w:u w:val="none"/>
         </w:rPr>
-        <w:t>role</w:t>
+        <w:t>csrf</w:t>
       </w:r>
       <w:r>
         <w:rPr>
@@ -1043,215 +1259,7 @@
           <w:color w:val="000000"/>
           <w:u w:val="none"/>
         </w:rPr>
-        <w:t>label</w:t>
-      </w:r>
-      <w:r>
-        <w:rPr>
-          <w:rFonts w:ascii="Times New Roman" w:hAnsi="Times New Roman" w:eastAsia="Times New Roman" w:cs="Times New Roman"/>
-          <w:color w:val="000000"/>
-          <w:u w:val="none"/>
-        </w:rPr>
-        <w:t xml:space="preserve">, </w:t>
-      </w:r>
-      <w:r>
-        <w:rPr>
-          <w:rFonts w:ascii="Times New Roman" w:hAnsi="Times New Roman" w:eastAsia="Times New Roman" w:cs="Times New Roman"/>
-          <w:color w:val="000000"/>
-          <w:u w:val="none"/>
-        </w:rPr>
-        <w:t>consent:true</w:t>
-      </w:r>
-      <w:r>
-        <w:rPr>
-          <w:rFonts w:ascii="Times New Roman" w:hAnsi="Times New Roman" w:eastAsia="Times New Roman" w:cs="Times New Roman"/>
-          <w:color w:val="000000"/>
-          <w:u w:val="none"/>
-        </w:rPr>
-        <w:t xml:space="preserve"> и необязательный </w:t>
-      </w:r>
-      <w:r>
-        <w:rPr>
-          <w:rFonts w:ascii="Times New Roman" w:hAnsi="Times New Roman" w:eastAsia="Times New Roman" w:cs="Times New Roman"/>
-          <w:color w:val="000000"/>
-          <w:u w:val="none"/>
-        </w:rPr>
-        <w:t>password</w:t>
-      </w:r>
-      <w:r>
-        <w:rPr>
-          <w:rFonts w:ascii="Times New Roman" w:hAnsi="Times New Roman" w:eastAsia="Times New Roman" w:cs="Times New Roman"/>
-          <w:color w:val="000000"/>
-          <w:u w:val="none"/>
-        </w:rPr>
-        <w:t xml:space="preserve"> длиной 12–128 символов. Разрешены только синтетические адреса </w:t>
-      </w:r>
-      <w:r>
-        <w:rPr>
-          <w:rFonts w:ascii="Times New Roman" w:hAnsi="Times New Roman" w:eastAsia="Times New Roman" w:cs="Times New Roman"/>
-          <w:color w:val="000000"/>
-          <w:u w:val="none"/>
-        </w:rPr>
-        <w:t>name@example.invalid</w:t>
-      </w:r>
-      <w:r>
-        <w:rPr>
-          <w:rFonts w:ascii="Times New Roman" w:hAnsi="Times New Roman" w:eastAsia="Times New Roman" w:cs="Times New Roman"/>
-          <w:color w:val="000000"/>
-          <w:u w:val="none"/>
-        </w:rPr>
-        <w:t xml:space="preserve">. При успехе 201 возвращает </w:t>
-      </w:r>
-      <w:r>
-        <w:rPr>
-          <w:rFonts w:ascii="Times New Roman" w:hAnsi="Times New Roman" w:eastAsia="Times New Roman" w:cs="Times New Roman"/>
-          <w:color w:val="000000"/>
-          <w:u w:val="none"/>
-        </w:rPr>
-        <w:t>DeliveryView</w:t>
-      </w:r>
-      <w:r>
-        <w:rPr>
-          <w:rFonts w:ascii="Times New Roman" w:hAnsi="Times New Roman" w:eastAsia="Times New Roman" w:cs="Times New Roman"/>
-          <w:color w:val="000000"/>
-          <w:u w:val="none"/>
-        </w:rPr>
-        <w:t xml:space="preserve">: </w:t>
-      </w:r>
-      <w:r>
-        <w:rPr>
-          <w:rFonts w:ascii="Times New Roman" w:hAnsi="Times New Roman" w:eastAsia="Times New Roman" w:cs="Times New Roman"/>
-          <w:color w:val="000000"/>
-          <w:u w:val="none"/>
-        </w:rPr>
-        <w:t>message</w:t>
-      </w:r>
-      <w:r>
-        <w:rPr>
-          <w:rFonts w:ascii="Times New Roman" w:hAnsi="Times New Roman" w:eastAsia="Times New Roman" w:cs="Times New Roman"/>
-          <w:color w:val="000000"/>
-          <w:u w:val="none"/>
-        </w:rPr>
-        <w:t xml:space="preserve">, </w:t>
-      </w:r>
-      <w:r>
-        <w:rPr>
-          <w:rFonts w:ascii="Times New Roman" w:hAnsi="Times New Roman" w:eastAsia="Times New Roman" w:cs="Times New Roman"/>
-          <w:color w:val="000000"/>
-          <w:u w:val="none"/>
-        </w:rPr>
-        <w:t>transport</w:t>
-      </w:r>
-      <w:r>
-        <w:rPr>
-          <w:rFonts w:ascii="Times New Roman" w:hAnsi="Times New Roman" w:eastAsia="Times New Roman" w:cs="Times New Roman"/>
-          <w:color w:val="000000"/>
-          <w:u w:val="none"/>
-        </w:rPr>
-        <w:t xml:space="preserve"> (</w:t>
-      </w:r>
-      <w:r>
-        <w:rPr>
-          <w:rFonts w:ascii="Times New Roman" w:hAnsi="Times New Roman" w:eastAsia="Times New Roman" w:cs="Times New Roman"/>
-          <w:color w:val="000000"/>
-          <w:u w:val="none"/>
-        </w:rPr>
-        <w:t>local-mailbox</w:t>
-      </w:r>
-      <w:r>
-        <w:rPr>
-          <w:rFonts w:ascii="Times New Roman" w:hAnsi="Times New Roman" w:eastAsia="Times New Roman" w:cs="Times New Roman"/>
-          <w:color w:val="000000"/>
-          <w:u w:val="none"/>
-        </w:rPr>
-        <w:t>/</w:t>
-      </w:r>
-      <w:r>
-        <w:rPr>
-          <w:rFonts w:ascii="Times New Roman" w:hAnsi="Times New Roman" w:eastAsia="Times New Roman" w:cs="Times New Roman"/>
-          <w:color w:val="000000"/>
-          <w:u w:val="none"/>
-        </w:rPr>
-        <w:t>smtp</w:t>
-      </w:r>
-      <w:r>
-        <w:rPr>
-          <w:rFonts w:ascii="Times New Roman" w:hAnsi="Times New Roman" w:eastAsia="Times New Roman" w:cs="Times New Roman"/>
-          <w:color w:val="000000"/>
-          <w:u w:val="none"/>
-        </w:rPr>
-        <w:t xml:space="preserve">), </w:t>
-      </w:r>
-      <w:r>
-        <w:rPr>
-          <w:rFonts w:ascii="Times New Roman" w:hAnsi="Times New Roman" w:eastAsia="Times New Roman" w:cs="Times New Roman"/>
-          <w:color w:val="000000"/>
-          <w:u w:val="none"/>
-        </w:rPr>
-        <w:t>delivery</w:t>
-      </w:r>
-      <w:r>
-        <w:rPr>
-          <w:rFonts w:ascii="Times New Roman" w:hAnsi="Times New Roman" w:eastAsia="Times New Roman" w:cs="Times New Roman"/>
-          <w:color w:val="000000"/>
-          <w:u w:val="none"/>
-        </w:rPr>
-        <w:t xml:space="preserve"> (</w:t>
-      </w:r>
-      <w:r>
-        <w:rPr>
-          <w:rFonts w:ascii="Times New Roman" w:hAnsi="Times New Roman" w:eastAsia="Times New Roman" w:cs="Times New Roman"/>
-          <w:color w:val="000000"/>
-          <w:u w:val="none"/>
-        </w:rPr>
-        <w:t>ready</w:t>
-      </w:r>
-      <w:r>
-        <w:rPr>
-          <w:rFonts w:ascii="Times New Roman" w:hAnsi="Times New Roman" w:eastAsia="Times New Roman" w:cs="Times New Roman"/>
-          <w:color w:val="000000"/>
-          <w:u w:val="none"/>
-        </w:rPr>
-        <w:t>/</w:t>
-      </w:r>
-      <w:r>
-        <w:rPr>
-          <w:rFonts w:ascii="Times New Roman" w:hAnsi="Times New Roman" w:eastAsia="Times New Roman" w:cs="Times New Roman"/>
-          <w:color w:val="000000"/>
-          <w:u w:val="none"/>
-        </w:rPr>
-        <w:t>failed</w:t>
-      </w:r>
-      <w:r>
-        <w:rPr>
-          <w:rFonts w:ascii="Times New Roman" w:hAnsi="Times New Roman" w:eastAsia="Times New Roman" w:cs="Times New Roman"/>
-          <w:color w:val="000000"/>
-          <w:u w:val="none"/>
-        </w:rPr>
-        <w:t xml:space="preserve">), </w:t>
-      </w:r>
-      <w:r>
-        <w:rPr>
-          <w:rFonts w:ascii="Times New Roman" w:hAnsi="Times New Roman" w:eastAsia="Times New Roman" w:cs="Times New Roman"/>
-          <w:color w:val="000000"/>
-          <w:u w:val="none"/>
-        </w:rPr>
-        <w:t>demo:true</w:t>
-      </w:r>
-      <w:r>
-        <w:rPr>
-          <w:rFonts w:ascii="Times New Roman" w:hAnsi="Times New Roman" w:eastAsia="Times New Roman" w:cs="Times New Roman"/>
-          <w:color w:val="000000"/>
-          <w:u w:val="none"/>
-        </w:rPr>
-        <w:t xml:space="preserve">. Сбой SMTP не отменяет регистрацию: ссылка уже подготовлена, доставку можно повторить через </w:t>
-      </w:r>
-      <w:r>
-        <w:rPr>
-          <w:rFonts w:ascii="Times New Roman" w:hAnsi="Times New Roman" w:eastAsia="Times New Roman" w:cs="Times New Roman"/>
-          <w:color w:val="000000"/>
-          <w:u w:val="none"/>
-        </w:rPr>
-        <w:t>/auth/login</w:t>
+        <w:t>demo</w:t>
       </w:r>
       <w:r>
         <w:rPr>
@@ -1269,47 +1277,7 @@
           <w:color w:val="000000"/>
           <w:u w:val="none"/>
         </w:rPr>
-        <w:t>GET /auth/mock-mail</w:t>
-      </w:r>
-      <w:r>
-        <w:rPr>
-          <w:rFonts w:ascii="Times New Roman" w:hAnsi="Times New Roman" w:eastAsia="Times New Roman" w:cs="Times New Roman"/>
-          <w:color w:val="000000"/>
-          <w:u w:val="none"/>
-        </w:rPr>
-        <w:t xml:space="preserve"> открыт и содержит одноразовые токены исключительно локальной демонстрационной почты. Срок ссылки — 30 минут. </w:t>
-      </w:r>
-      <w:r>
-        <w:rPr>
-          <w:rFonts w:ascii="Times New Roman" w:hAnsi="Times New Roman" w:eastAsia="Times New Roman" w:cs="Times New Roman"/>
-          <w:color w:val="000000"/>
-          <w:u w:val="none"/>
-        </w:rPr>
-        <w:t>/auth/verify</w:t>
-      </w:r>
-      <w:r>
-        <w:rPr>
-          <w:rFonts w:ascii="Times New Roman" w:hAnsi="Times New Roman" w:eastAsia="Times New Roman" w:cs="Times New Roman"/>
-          <w:color w:val="000000"/>
-          <w:u w:val="none"/>
-        </w:rPr>
-        <w:t xml:space="preserve"> принимает </w:t>
-      </w:r>
-      <w:r>
-        <w:rPr>
-          <w:rFonts w:ascii="Times New Roman" w:hAnsi="Times New Roman" w:eastAsia="Times New Roman" w:cs="Times New Roman"/>
-          <w:color w:val="000000"/>
-          <w:u w:val="none"/>
-        </w:rPr>
-        <w:t>{ "token": "&lt;полученный локально токен&gt;" }</w:t>
-      </w:r>
-      <w:r>
-        <w:rPr>
-          <w:rFonts w:ascii="Times New Roman" w:hAnsi="Times New Roman" w:eastAsia="Times New Roman" w:cs="Times New Roman"/>
-          <w:color w:val="000000"/>
-          <w:u w:val="none"/>
-        </w:rPr>
-        <w:t xml:space="preserve">, подтверждает адрес и создаёт сессию; повторное/просроченное подтверждение — 409. </w:t>
+        <w:t xml:space="preserve">Сохраните логин; после выхода используйте </w:t>
       </w:r>
       <w:r>
         <w:rPr>
@@ -1325,556 +1293,7 @@
           <w:color w:val="000000"/>
           <w:u w:val="none"/>
         </w:rPr>
-        <w:t xml:space="preserve"> принимает </w:t>
-      </w:r>
-      <w:r>
-        <w:rPr>
-          <w:rFonts w:ascii="Times New Roman" w:hAnsi="Times New Roman" w:eastAsia="Times New Roman" w:cs="Times New Roman"/>
-          <w:color w:val="000000"/>
-          <w:u w:val="none"/>
-        </w:rPr>
-        <w:t>email/password</w:t>
-      </w:r>
-      <w:r>
-        <w:rPr>
-          <w:rFonts w:ascii="Times New Roman" w:hAnsi="Times New Roman" w:eastAsia="Times New Roman" w:cs="Times New Roman"/>
-          <w:color w:val="000000"/>
-          <w:u w:val="none"/>
-        </w:rPr>
-        <w:t>, требует подтверждённого адреса; неправильные данные — 401, неподтверждённый адрес — 403. Внешнее владение реальным email эта открытая demo-почта не доказывает.</w:t>
-      </w:r>
-    </w:p>
-    <w:p>
-      <w:r>
-        <w:rPr>
-          <w:rFonts w:ascii="Times New Roman" w:hAnsi="Times New Roman" w:eastAsia="Times New Roman" w:cs="Times New Roman"/>
-          <w:color w:val="000000"/>
-          <w:u w:val="none"/>
-        </w:rPr>
-        <w:t>PUT /candidate/profile</w:t>
-      </w:r>
-      <w:r>
-        <w:rPr>
-          <w:rFonts w:ascii="Times New Roman" w:hAnsi="Times New Roman" w:eastAsia="Times New Roman" w:cs="Times New Roman"/>
-          <w:color w:val="000000"/>
-          <w:u w:val="none"/>
-        </w:rPr>
-        <w:t xml:space="preserve"> — полная замена редактируемых полей </w:t>
-      </w:r>
-      <w:r>
-        <w:rPr>
-          <w:rFonts w:ascii="Times New Roman" w:hAnsi="Times New Roman" w:eastAsia="Times New Roman" w:cs="Times New Roman"/>
-          <w:color w:val="000000"/>
-          <w:u w:val="none"/>
-        </w:rPr>
-        <w:t>ProfileInput</w:t>
-      </w:r>
-      <w:r>
-        <w:rPr>
-          <w:rFonts w:ascii="Times New Roman" w:hAnsi="Times New Roman" w:eastAsia="Times New Roman" w:cs="Times New Roman"/>
-          <w:color w:val="000000"/>
-          <w:u w:val="none"/>
-        </w:rPr>
-        <w:t xml:space="preserve">, не PATCH. Клиент задаёт </w:t>
-      </w:r>
-      <w:r>
-        <w:rPr>
-          <w:rFonts w:ascii="Times New Roman" w:hAnsi="Times New Roman" w:eastAsia="Times New Roman" w:cs="Times New Roman"/>
-          <w:color w:val="000000"/>
-          <w:u w:val="none"/>
-        </w:rPr>
-        <w:t>claimed_grade</w:t>
-      </w:r>
-      <w:r>
-        <w:rPr>
-          <w:rFonts w:ascii="Times New Roman" w:hAnsi="Times New Roman" w:eastAsia="Times New Roman" w:cs="Times New Roman"/>
-          <w:color w:val="000000"/>
-          <w:u w:val="none"/>
-        </w:rPr>
-        <w:t xml:space="preserve">, а не </w:t>
-      </w:r>
-      <w:r>
-        <w:rPr>
-          <w:rFonts w:ascii="Times New Roman" w:hAnsi="Times New Roman" w:eastAsia="Times New Roman" w:cs="Times New Roman"/>
-          <w:color w:val="000000"/>
-          <w:u w:val="none"/>
-        </w:rPr>
-        <w:t>confirmed_grade</w:t>
-      </w:r>
-      <w:r>
-        <w:rPr>
-          <w:rFonts w:ascii="Times New Roman" w:hAnsi="Times New Roman" w:eastAsia="Times New Roman" w:cs="Times New Roman"/>
-          <w:color w:val="000000"/>
-          <w:u w:val="none"/>
-        </w:rPr>
-        <w:t xml:space="preserve">, </w:t>
-      </w:r>
-      <w:r>
-        <w:rPr>
-          <w:rFonts w:ascii="Times New Roman" w:hAnsi="Times New Roman" w:eastAsia="Times New Roman" w:cs="Times New Roman"/>
-          <w:color w:val="000000"/>
-          <w:u w:val="none"/>
-        </w:rPr>
-        <w:t>skills</w:t>
-      </w:r>
-      <w:r>
-        <w:rPr>
-          <w:rFonts w:ascii="Times New Roman" w:hAnsi="Times New Roman" w:eastAsia="Times New Roman" w:cs="Times New Roman"/>
-          <w:color w:val="000000"/>
-          <w:u w:val="none"/>
-        </w:rPr>
-        <w:t xml:space="preserve"> или </w:t>
-      </w:r>
-      <w:r>
-        <w:rPr>
-          <w:rFonts w:ascii="Times New Roman" w:hAnsi="Times New Roman" w:eastAsia="Times New Roman" w:cs="Times New Roman"/>
-          <w:color w:val="000000"/>
-          <w:u w:val="none"/>
-        </w:rPr>
-        <w:t>test_score</w:t>
-      </w:r>
-      <w:r>
-        <w:rPr>
-          <w:rFonts w:ascii="Times New Roman" w:hAnsi="Times New Roman" w:eastAsia="Times New Roman" w:cs="Times New Roman"/>
-          <w:color w:val="000000"/>
-          <w:u w:val="none"/>
-        </w:rPr>
-        <w:t xml:space="preserve">. </w:t>
-      </w:r>
-      <w:r>
-        <w:rPr>
-          <w:rFonts w:ascii="Times New Roman" w:hAnsi="Times New Roman" w:eastAsia="Times New Roman" w:cs="Times New Roman"/>
-          <w:color w:val="000000"/>
-          <w:u w:val="none"/>
-        </w:rPr>
-        <w:t>industry=it</w:t>
-      </w:r>
-      <w:r>
-        <w:rPr>
-          <w:rFonts w:ascii="Times New Roman" w:hAnsi="Times New Roman" w:eastAsia="Times New Roman" w:cs="Times New Roman"/>
-          <w:color w:val="000000"/>
-          <w:u w:val="none"/>
-        </w:rPr>
-        <w:t xml:space="preserve">; специализации </w:t>
-      </w:r>
-      <w:r>
-        <w:rPr>
-          <w:rFonts w:ascii="Times New Roman" w:hAnsi="Times New Roman" w:eastAsia="Times New Roman" w:cs="Times New Roman"/>
-          <w:color w:val="000000"/>
-          <w:u w:val="none"/>
-        </w:rPr>
-        <w:t>backend/frontend/qa</w:t>
-      </w:r>
-      <w:r>
-        <w:rPr>
-          <w:rFonts w:ascii="Times New Roman" w:hAnsi="Times New Roman" w:eastAsia="Times New Roman" w:cs="Times New Roman"/>
-          <w:color w:val="000000"/>
-          <w:u w:val="none"/>
-        </w:rPr>
-        <w:t xml:space="preserve">, грейды </w:t>
-      </w:r>
-      <w:r>
-        <w:rPr>
-          <w:rFonts w:ascii="Times New Roman" w:hAnsi="Times New Roman" w:eastAsia="Times New Roman" w:cs="Times New Roman"/>
-          <w:color w:val="000000"/>
-          <w:u w:val="none"/>
-        </w:rPr>
-        <w:t>junior/middle</w:t>
-      </w:r>
-      <w:r>
-        <w:rPr>
-          <w:rFonts w:ascii="Times New Roman" w:hAnsi="Times New Roman" w:eastAsia="Times New Roman" w:cs="Times New Roman"/>
-          <w:color w:val="000000"/>
-          <w:u w:val="none"/>
-        </w:rPr>
-        <w:t xml:space="preserve">, формат </w:t>
-      </w:r>
-      <w:r>
-        <w:rPr>
-          <w:rFonts w:ascii="Times New Roman" w:hAnsi="Times New Roman" w:eastAsia="Times New Roman" w:cs="Times New Roman"/>
-          <w:color w:val="000000"/>
-          <w:u w:val="none"/>
-        </w:rPr>
-        <w:t>remote/hybrid/office</w:t>
-      </w:r>
-      <w:r>
-        <w:rPr>
-          <w:rFonts w:ascii="Times New Roman" w:hAnsi="Times New Roman" w:eastAsia="Times New Roman" w:cs="Times New Roman"/>
-          <w:color w:val="000000"/>
-          <w:u w:val="none"/>
-        </w:rPr>
-        <w:t xml:space="preserve">. Строгие целые зарплаты указаны в RUB. Резюме содержит </w:t>
-      </w:r>
-      <w:r>
-        <w:rPr>
-          <w:rFonts w:ascii="Times New Roman" w:hAnsi="Times New Roman" w:eastAsia="Times New Roman" w:cs="Times New Roman"/>
-          <w:color w:val="000000"/>
-          <w:u w:val="none"/>
-        </w:rPr>
-        <w:t>full_name</w:t>
-      </w:r>
-      <w:r>
-        <w:rPr>
-          <w:rFonts w:ascii="Times New Roman" w:hAnsi="Times New Roman" w:eastAsia="Times New Roman" w:cs="Times New Roman"/>
-          <w:color w:val="000000"/>
-          <w:u w:val="none"/>
-        </w:rPr>
-        <w:t xml:space="preserve">, </w:t>
-      </w:r>
-      <w:r>
-        <w:rPr>
-          <w:rFonts w:ascii="Times New Roman" w:hAnsi="Times New Roman" w:eastAsia="Times New Roman" w:cs="Times New Roman"/>
-          <w:color w:val="000000"/>
-          <w:u w:val="none"/>
-        </w:rPr>
-        <w:t>years_experience</w:t>
-      </w:r>
-      <w:r>
-        <w:rPr>
-          <w:rFonts w:ascii="Times New Roman" w:hAnsi="Times New Roman" w:eastAsia="Times New Roman" w:cs="Times New Roman"/>
-          <w:color w:val="000000"/>
-          <w:u w:val="none"/>
-        </w:rPr>
-        <w:t xml:space="preserve">, </w:t>
-      </w:r>
-      <w:r>
-        <w:rPr>
-          <w:rFonts w:ascii="Times New Roman" w:hAnsi="Times New Roman" w:eastAsia="Times New Roman" w:cs="Times New Roman"/>
-          <w:color w:val="000000"/>
-          <w:u w:val="none"/>
-        </w:rPr>
-        <w:t>roles</w:t>
-      </w:r>
-      <w:r>
-        <w:rPr>
-          <w:rFonts w:ascii="Times New Roman" w:hAnsi="Times New Roman" w:eastAsia="Times New Roman" w:cs="Times New Roman"/>
-          <w:color w:val="000000"/>
-          <w:u w:val="none"/>
-        </w:rPr>
-        <w:t xml:space="preserve">, </w:t>
-      </w:r>
-      <w:r>
-        <w:rPr>
-          <w:rFonts w:ascii="Times New Roman" w:hAnsi="Times New Roman" w:eastAsia="Times New Roman" w:cs="Times New Roman"/>
-          <w:color w:val="000000"/>
-          <w:u w:val="none"/>
-        </w:rPr>
-        <w:t>soft_skills</w:t>
-      </w:r>
-      <w:r>
-        <w:rPr>
-          <w:rFonts w:ascii="Times New Roman" w:hAnsi="Times New Roman" w:eastAsia="Times New Roman" w:cs="Times New Roman"/>
-          <w:color w:val="000000"/>
-          <w:u w:val="none"/>
-        </w:rPr>
-        <w:t xml:space="preserve">, </w:t>
-      </w:r>
-      <w:r>
-        <w:rPr>
-          <w:rFonts w:ascii="Times New Roman" w:hAnsi="Times New Roman" w:eastAsia="Times New Roman" w:cs="Times New Roman"/>
-          <w:color w:val="000000"/>
-          <w:u w:val="none"/>
-        </w:rPr>
-        <w:t>education</w:t>
-      </w:r>
-      <w:r>
-        <w:rPr>
-          <w:rFonts w:ascii="Times New Roman" w:hAnsi="Times New Roman" w:eastAsia="Times New Roman" w:cs="Times New Roman"/>
-          <w:color w:val="000000"/>
-          <w:u w:val="none"/>
-        </w:rPr>
-        <w:t xml:space="preserve">, </w:t>
-      </w:r>
-      <w:r>
-        <w:rPr>
-          <w:rFonts w:ascii="Times New Roman" w:hAnsi="Times New Roman" w:eastAsia="Times New Roman" w:cs="Times New Roman"/>
-          <w:color w:val="000000"/>
-          <w:u w:val="none"/>
-        </w:rPr>
-        <w:t>about</w:t>
-      </w:r>
-      <w:r>
-        <w:rPr>
-          <w:rFonts w:ascii="Times New Roman" w:hAnsi="Times New Roman" w:eastAsia="Times New Roman" w:cs="Times New Roman"/>
-          <w:color w:val="000000"/>
-          <w:u w:val="none"/>
-        </w:rPr>
-        <w:t xml:space="preserve">, </w:t>
-      </w:r>
-      <w:r>
-        <w:rPr>
-          <w:rFonts w:ascii="Times New Roman" w:hAnsi="Times New Roman" w:eastAsia="Times New Roman" w:cs="Times New Roman"/>
-          <w:color w:val="000000"/>
-          <w:u w:val="none"/>
-        </w:rPr>
-        <w:t>declared_skills</w:t>
-      </w:r>
-      <w:r>
-        <w:rPr>
-          <w:rFonts w:ascii="Times New Roman" w:hAnsi="Times New Roman" w:eastAsia="Times New Roman" w:cs="Times New Roman"/>
-          <w:color w:val="000000"/>
-          <w:u w:val="none"/>
-        </w:rPr>
-        <w:t xml:space="preserve">; заполнение не подтверждает компетентность. </w:t>
-      </w:r>
-      <w:r>
-        <w:rPr>
-          <w:rFonts w:ascii="Times New Roman" w:hAnsi="Times New Roman" w:eastAsia="Times New Roman" w:cs="Times New Roman"/>
-          <w:color w:val="000000"/>
-          <w:u w:val="none"/>
-        </w:rPr>
-        <w:t>resume.declared_skills</w:t>
-      </w:r>
-      <w:r>
-        <w:rPr>
-          <w:rFonts w:ascii="Times New Roman" w:hAnsi="Times New Roman" w:eastAsia="Times New Roman" w:cs="Times New Roman"/>
-          <w:color w:val="000000"/>
-          <w:u w:val="none"/>
-        </w:rPr>
-        <w:t xml:space="preserve"> — до 20 ID технологий из </w:t>
-      </w:r>
-      <w:r>
-        <w:rPr>
-          <w:rFonts w:ascii="Times New Roman" w:hAnsi="Times New Roman" w:eastAsia="Times New Roman" w:cs="Times New Roman"/>
-          <w:color w:val="000000"/>
-          <w:u w:val="none"/>
-        </w:rPr>
-        <w:t>declared_skills</w:t>
-      </w:r>
-      <w:r>
-        <w:rPr>
-          <w:rFonts w:ascii="Times New Roman" w:hAnsi="Times New Roman" w:eastAsia="Times New Roman" w:cs="Times New Roman"/>
-          <w:color w:val="000000"/>
-          <w:u w:val="none"/>
-        </w:rPr>
-        <w:t xml:space="preserve"> ответа </w:t>
-      </w:r>
-      <w:r>
-        <w:rPr>
-          <w:rFonts w:ascii="Times New Roman" w:hAnsi="Times New Roman" w:eastAsia="Times New Roman" w:cs="Times New Roman"/>
-          <w:color w:val="000000"/>
-          <w:u w:val="none"/>
-        </w:rPr>
-        <w:t>/catalog</w:t>
-      </w:r>
-      <w:r>
-        <w:rPr>
-          <w:rFonts w:ascii="Times New Roman" w:hAnsi="Times New Roman" w:eastAsia="Times New Roman" w:cs="Times New Roman"/>
-          <w:color w:val="000000"/>
-          <w:u w:val="none"/>
-        </w:rPr>
-        <w:t xml:space="preserve">, по умолчанию </w:t>
-      </w:r>
-      <w:r>
-        <w:rPr>
-          <w:rFonts w:ascii="Times New Roman" w:hAnsi="Times New Roman" w:eastAsia="Times New Roman" w:cs="Times New Roman"/>
-          <w:color w:val="000000"/>
-          <w:u w:val="none"/>
-        </w:rPr>
-        <w:t>[]</w:t>
-      </w:r>
-      <w:r>
-        <w:rPr>
-          <w:rFonts w:ascii="Times New Roman" w:hAnsi="Times New Roman" w:eastAsia="Times New Roman" w:cs="Times New Roman"/>
-          <w:color w:val="000000"/>
-          <w:u w:val="none"/>
-        </w:rPr>
-        <w:t xml:space="preserve">. Повторы удаляются с сохранением порядка, неизвестный ID даёт 422. При полном PUT передавайте текущий список, чтобы сохранить заявления. React/Vue/Go/Java можно заявить, но оценочная категория остаётся одной из трёх доступных специализаций; заявление не обновляет </w:t>
-      </w:r>
-      <w:r>
-        <w:rPr>
-          <w:rFonts w:ascii="Times New Roman" w:hAnsi="Times New Roman" w:eastAsia="Times New Roman" w:cs="Times New Roman"/>
-          <w:color w:val="000000"/>
-          <w:u w:val="none"/>
-        </w:rPr>
-        <w:t>skills</w:t>
-      </w:r>
-      <w:r>
-        <w:rPr>
-          <w:rFonts w:ascii="Times New Roman" w:hAnsi="Times New Roman" w:eastAsia="Times New Roman" w:cs="Times New Roman"/>
-          <w:color w:val="000000"/>
-          <w:u w:val="none"/>
-        </w:rPr>
-        <w:t>, балл или публикацию. Смена специализации снимает публикацию и переключает подтверждённый результат на историю выбранного направления, не переносит квалификацию из другого.</w:t>
-      </w:r>
-    </w:p>
-    <w:p>
-      <w:r>
-        <w:rPr>
-          <w:rFonts w:ascii="Times New Roman" w:hAnsi="Times New Roman" w:eastAsia="Times New Roman" w:cs="Times New Roman"/>
-          <w:color w:val="000000"/>
-          <w:u w:val="none"/>
-        </w:rPr>
-        <w:t>POST /candidate/resume-preview</w:t>
-      </w:r>
-      <w:r>
-        <w:rPr>
-          <w:rFonts w:ascii="Times New Roman" w:hAnsi="Times New Roman" w:eastAsia="Times New Roman" w:cs="Times New Roman"/>
-          <w:color w:val="000000"/>
-          <w:u w:val="none"/>
-        </w:rPr>
-        <w:t xml:space="preserve"> принимает </w:t>
-      </w:r>
-      <w:r>
-        <w:rPr>
-          <w:rFonts w:ascii="Times New Roman" w:hAnsi="Times New Roman" w:eastAsia="Times New Roman" w:cs="Times New Roman"/>
-          <w:b/>
-          <w:color w:val="000000"/>
-          <w:u w:val="none"/>
-        </w:rPr>
-        <w:t>сам PDF в теле</w:t>
-      </w:r>
-      <w:r>
-        <w:rPr>
-          <w:rFonts w:ascii="Times New Roman" w:hAnsi="Times New Roman" w:eastAsia="Times New Roman" w:cs="Times New Roman"/>
-          <w:color w:val="000000"/>
-          <w:u w:val="none"/>
-        </w:rPr>
-        <w:t xml:space="preserve">, </w:t>
-      </w:r>
-      <w:r>
-        <w:rPr>
-          <w:rFonts w:ascii="Times New Roman" w:hAnsi="Times New Roman" w:eastAsia="Times New Roman" w:cs="Times New Roman"/>
-          <w:color w:val="000000"/>
-          <w:u w:val="none"/>
-        </w:rPr>
-        <w:t>Content-Type: application/pdf</w:t>
-      </w:r>
-      <w:r>
-        <w:rPr>
-          <w:rFonts w:ascii="Times New Roman" w:hAnsi="Times New Roman" w:eastAsia="Times New Roman" w:cs="Times New Roman"/>
-          <w:color w:val="000000"/>
-          <w:u w:val="none"/>
-        </w:rPr>
-        <w:t xml:space="preserve">, до 2 MiB. Это не multipart/form-data. Ответ </w:t>
-      </w:r>
-      <w:r>
-        <w:rPr>
-          <w:rFonts w:ascii="Times New Roman" w:hAnsi="Times New Roman" w:eastAsia="Times New Roman" w:cs="Times New Roman"/>
-          <w:color w:val="000000"/>
-          <w:u w:val="none"/>
-        </w:rPr>
-        <w:t>ResumePreviewView</w:t>
-      </w:r>
-      <w:r>
-        <w:rPr>
-          <w:rFonts w:ascii="Times New Roman" w:hAnsi="Times New Roman" w:eastAsia="Times New Roman" w:cs="Times New Roman"/>
-          <w:color w:val="000000"/>
-          <w:u w:val="none"/>
-        </w:rPr>
-        <w:t xml:space="preserve"> предлагает </w:t>
-      </w:r>
-      <w:r>
-        <w:rPr>
-          <w:rFonts w:ascii="Times New Roman" w:hAnsi="Times New Roman" w:eastAsia="Times New Roman" w:cs="Times New Roman"/>
-          <w:color w:val="000000"/>
-          <w:u w:val="none"/>
-        </w:rPr>
-        <w:t>resume</w:t>
-      </w:r>
-      <w:r>
-        <w:rPr>
-          <w:rFonts w:ascii="Times New Roman" w:hAnsi="Times New Roman" w:eastAsia="Times New Roman" w:cs="Times New Roman"/>
-          <w:color w:val="000000"/>
-          <w:u w:val="none"/>
-        </w:rPr>
-        <w:t xml:space="preserve">, </w:t>
-      </w:r>
-      <w:r>
-        <w:rPr>
-          <w:rFonts w:ascii="Times New Roman" w:hAnsi="Times New Roman" w:eastAsia="Times New Roman" w:cs="Times New Roman"/>
-          <w:color w:val="000000"/>
-          <w:u w:val="none"/>
-        </w:rPr>
-        <w:t>contact</w:t>
-      </w:r>
-      <w:r>
-        <w:rPr>
-          <w:rFonts w:ascii="Times New Roman" w:hAnsi="Times New Roman" w:eastAsia="Times New Roman" w:cs="Times New Roman"/>
-          <w:color w:val="000000"/>
-          <w:u w:val="none"/>
-        </w:rPr>
-        <w:t xml:space="preserve">, </w:t>
-      </w:r>
-      <w:r>
-        <w:rPr>
-          <w:rFonts w:ascii="Times New Roman" w:hAnsi="Times New Roman" w:eastAsia="Times New Roman" w:cs="Times New Roman"/>
-          <w:color w:val="000000"/>
-          <w:u w:val="none"/>
-        </w:rPr>
-        <w:t>specialization</w:t>
-      </w:r>
-      <w:r>
-        <w:rPr>
-          <w:rFonts w:ascii="Times New Roman" w:hAnsi="Times New Roman" w:eastAsia="Times New Roman" w:cs="Times New Roman"/>
-          <w:color w:val="000000"/>
-          <w:u w:val="none"/>
-        </w:rPr>
-        <w:t xml:space="preserve">, </w:t>
-      </w:r>
-      <w:r>
-        <w:rPr>
-          <w:rFonts w:ascii="Times New Roman" w:hAnsi="Times New Roman" w:eastAsia="Times New Roman" w:cs="Times New Roman"/>
-          <w:color w:val="000000"/>
-          <w:u w:val="none"/>
-        </w:rPr>
-        <w:t>claimed_grade</w:t>
-      </w:r>
-      <w:r>
-        <w:rPr>
-          <w:rFonts w:ascii="Times New Roman" w:hAnsi="Times New Roman" w:eastAsia="Times New Roman" w:cs="Times New Roman"/>
-          <w:color w:val="000000"/>
-          <w:u w:val="none"/>
-        </w:rPr>
-        <w:t xml:space="preserve">, </w:t>
-      </w:r>
-      <w:r>
-        <w:rPr>
-          <w:rFonts w:ascii="Times New Roman" w:hAnsi="Times New Roman" w:eastAsia="Times New Roman" w:cs="Times New Roman"/>
-          <w:color w:val="000000"/>
-          <w:u w:val="none"/>
-        </w:rPr>
-        <w:t>claimed_skills</w:t>
-      </w:r>
-      <w:r>
-        <w:rPr>
-          <w:rFonts w:ascii="Times New Roman" w:hAnsi="Times New Roman" w:eastAsia="Times New Roman" w:cs="Times New Roman"/>
-          <w:color w:val="000000"/>
-          <w:u w:val="none"/>
-        </w:rPr>
-        <w:t xml:space="preserve">, </w:t>
-      </w:r>
-      <w:r>
-        <w:rPr>
-          <w:rFonts w:ascii="Times New Roman" w:hAnsi="Times New Roman" w:eastAsia="Times New Roman" w:cs="Times New Roman"/>
-          <w:color w:val="000000"/>
-          <w:u w:val="none"/>
-        </w:rPr>
-        <w:t>warnings</w:t>
-      </w:r>
-      <w:r>
-        <w:rPr>
-          <w:rFonts w:ascii="Times New Roman" w:hAnsi="Times New Roman" w:eastAsia="Times New Roman" w:cs="Times New Roman"/>
-          <w:color w:val="000000"/>
-          <w:u w:val="none"/>
-        </w:rPr>
-        <w:t xml:space="preserve">, </w:t>
-      </w:r>
-      <w:r>
-        <w:rPr>
-          <w:rFonts w:ascii="Times New Roman" w:hAnsi="Times New Roman" w:eastAsia="Times New Roman" w:cs="Times New Roman"/>
-          <w:color w:val="000000"/>
-          <w:u w:val="none"/>
-        </w:rPr>
-        <w:t>demo</w:t>
-      </w:r>
-      <w:r>
-        <w:rPr>
-          <w:rFonts w:ascii="Times New Roman" w:hAnsi="Times New Roman" w:eastAsia="Times New Roman" w:cs="Times New Roman"/>
-          <w:color w:val="000000"/>
-          <w:u w:val="none"/>
-        </w:rPr>
-        <w:t>. Предпросмотр ничего не сохраняет: пользователь подтверждает поля отдельным PUT профиля. Парсинг эвристический, для текстового PDF, без OCR; ошибки/timeout — 422, слишком большой файл — 413, неправильный Content-Type — 415.</w:t>
+        <w:t>. Пароль не возвращается сервером и не сохраняется в браузере. Подтверждение реальной почты этот режим не выполняет; полный локальный контур подтверждения описан ниже. Регистрацию ограничивают 200 аккаунтов и пять запросов в час на клиентский IP. Переполнение и частые запросы возвращают 429, отсутствие opt-in — 404. Посторонний Origin отклоняется до расходования лимита. Запрос из действующей сессии возвращает 409: сначала нужно выйти. Общие seed-аккаунты и mock-почта в индивидуальном показе недоступны. Последующие изменения требуют CSRF.</w:t>
       </w:r>
     </w:p>
     <w:p>
@@ -1887,7 +1306,909 @@
           <w:color w:val="000000"/>
           <w:u w:val="none"/>
         </w:rPr>
-        <w:t>4. Каталог и основания навыков</w:t>
+        <w:t>4. Регистрация и профиль</w:t>
+      </w:r>
+    </w:p>
+    <w:p>
+      <w:r>
+        <w:rPr>
+          <w:rFonts w:ascii="Times New Roman" w:hAnsi="Times New Roman" w:eastAsia="Times New Roman" w:cs="Times New Roman"/>
+          <w:color w:val="000000"/>
+          <w:u w:val="none"/>
+        </w:rPr>
+        <w:t>POST /api/v1/auth/register</w:t>
+      </w:r>
+      <w:r>
+        <w:rPr>
+          <w:rFonts w:ascii="Times New Roman" w:hAnsi="Times New Roman" w:eastAsia="Times New Roman" w:cs="Times New Roman"/>
+          <w:color w:val="000000"/>
+          <w:u w:val="none"/>
+        </w:rPr>
+        <w:t xml:space="preserve"> принимает </w:t>
+      </w:r>
+      <w:r>
+        <w:rPr>
+          <w:rFonts w:ascii="Times New Roman" w:hAnsi="Times New Roman" w:eastAsia="Times New Roman" w:cs="Times New Roman"/>
+          <w:color w:val="000000"/>
+          <w:u w:val="none"/>
+        </w:rPr>
+        <w:t>email</w:t>
+      </w:r>
+      <w:r>
+        <w:rPr>
+          <w:rFonts w:ascii="Times New Roman" w:hAnsi="Times New Roman" w:eastAsia="Times New Roman" w:cs="Times New Roman"/>
+          <w:color w:val="000000"/>
+          <w:u w:val="none"/>
+        </w:rPr>
+        <w:t xml:space="preserve">, </w:t>
+      </w:r>
+      <w:r>
+        <w:rPr>
+          <w:rFonts w:ascii="Times New Roman" w:hAnsi="Times New Roman" w:eastAsia="Times New Roman" w:cs="Times New Roman"/>
+          <w:color w:val="000000"/>
+          <w:u w:val="none"/>
+        </w:rPr>
+        <w:t>role</w:t>
+      </w:r>
+      <w:r>
+        <w:rPr>
+          <w:rFonts w:ascii="Times New Roman" w:hAnsi="Times New Roman" w:eastAsia="Times New Roman" w:cs="Times New Roman"/>
+          <w:color w:val="000000"/>
+          <w:u w:val="none"/>
+        </w:rPr>
+        <w:t xml:space="preserve">, </w:t>
+      </w:r>
+      <w:r>
+        <w:rPr>
+          <w:rFonts w:ascii="Times New Roman" w:hAnsi="Times New Roman" w:eastAsia="Times New Roman" w:cs="Times New Roman"/>
+          <w:color w:val="000000"/>
+          <w:u w:val="none"/>
+        </w:rPr>
+        <w:t>label</w:t>
+      </w:r>
+      <w:r>
+        <w:rPr>
+          <w:rFonts w:ascii="Times New Roman" w:hAnsi="Times New Roman" w:eastAsia="Times New Roman" w:cs="Times New Roman"/>
+          <w:color w:val="000000"/>
+          <w:u w:val="none"/>
+        </w:rPr>
+        <w:t xml:space="preserve">, </w:t>
+      </w:r>
+      <w:r>
+        <w:rPr>
+          <w:rFonts w:ascii="Times New Roman" w:hAnsi="Times New Roman" w:eastAsia="Times New Roman" w:cs="Times New Roman"/>
+          <w:color w:val="000000"/>
+          <w:u w:val="none"/>
+        </w:rPr>
+        <w:t>consent:true</w:t>
+      </w:r>
+      <w:r>
+        <w:rPr>
+          <w:rFonts w:ascii="Times New Roman" w:hAnsi="Times New Roman" w:eastAsia="Times New Roman" w:cs="Times New Roman"/>
+          <w:color w:val="000000"/>
+          <w:u w:val="none"/>
+        </w:rPr>
+        <w:t xml:space="preserve"> и необязательный </w:t>
+      </w:r>
+      <w:r>
+        <w:rPr>
+          <w:rFonts w:ascii="Times New Roman" w:hAnsi="Times New Roman" w:eastAsia="Times New Roman" w:cs="Times New Roman"/>
+          <w:color w:val="000000"/>
+          <w:u w:val="none"/>
+        </w:rPr>
+        <w:t>password</w:t>
+      </w:r>
+      <w:r>
+        <w:rPr>
+          <w:rFonts w:ascii="Times New Roman" w:hAnsi="Times New Roman" w:eastAsia="Times New Roman" w:cs="Times New Roman"/>
+          <w:color w:val="000000"/>
+          <w:u w:val="none"/>
+        </w:rPr>
+        <w:t xml:space="preserve"> длиной 12–128 символов. Разрешены только синтетические адреса </w:t>
+      </w:r>
+      <w:r>
+        <w:rPr>
+          <w:rFonts w:ascii="Times New Roman" w:hAnsi="Times New Roman" w:eastAsia="Times New Roman" w:cs="Times New Roman"/>
+          <w:color w:val="000000"/>
+          <w:u w:val="none"/>
+        </w:rPr>
+        <w:t>name@example.invalid</w:t>
+      </w:r>
+      <w:r>
+        <w:rPr>
+          <w:rFonts w:ascii="Times New Roman" w:hAnsi="Times New Roman" w:eastAsia="Times New Roman" w:cs="Times New Roman"/>
+          <w:color w:val="000000"/>
+          <w:u w:val="none"/>
+        </w:rPr>
+        <w:t xml:space="preserve">. При успехе 201 возвращает </w:t>
+      </w:r>
+      <w:r>
+        <w:rPr>
+          <w:rFonts w:ascii="Times New Roman" w:hAnsi="Times New Roman" w:eastAsia="Times New Roman" w:cs="Times New Roman"/>
+          <w:color w:val="000000"/>
+          <w:u w:val="none"/>
+        </w:rPr>
+        <w:t>DeliveryView</w:t>
+      </w:r>
+      <w:r>
+        <w:rPr>
+          <w:rFonts w:ascii="Times New Roman" w:hAnsi="Times New Roman" w:eastAsia="Times New Roman" w:cs="Times New Roman"/>
+          <w:color w:val="000000"/>
+          <w:u w:val="none"/>
+        </w:rPr>
+        <w:t xml:space="preserve">: </w:t>
+      </w:r>
+      <w:r>
+        <w:rPr>
+          <w:rFonts w:ascii="Times New Roman" w:hAnsi="Times New Roman" w:eastAsia="Times New Roman" w:cs="Times New Roman"/>
+          <w:color w:val="000000"/>
+          <w:u w:val="none"/>
+        </w:rPr>
+        <w:t>message</w:t>
+      </w:r>
+      <w:r>
+        <w:rPr>
+          <w:rFonts w:ascii="Times New Roman" w:hAnsi="Times New Roman" w:eastAsia="Times New Roman" w:cs="Times New Roman"/>
+          <w:color w:val="000000"/>
+          <w:u w:val="none"/>
+        </w:rPr>
+        <w:t xml:space="preserve">, </w:t>
+      </w:r>
+      <w:r>
+        <w:rPr>
+          <w:rFonts w:ascii="Times New Roman" w:hAnsi="Times New Roman" w:eastAsia="Times New Roman" w:cs="Times New Roman"/>
+          <w:color w:val="000000"/>
+          <w:u w:val="none"/>
+        </w:rPr>
+        <w:t>transport</w:t>
+      </w:r>
+      <w:r>
+        <w:rPr>
+          <w:rFonts w:ascii="Times New Roman" w:hAnsi="Times New Roman" w:eastAsia="Times New Roman" w:cs="Times New Roman"/>
+          <w:color w:val="000000"/>
+          <w:u w:val="none"/>
+        </w:rPr>
+        <w:t xml:space="preserve"> (</w:t>
+      </w:r>
+      <w:r>
+        <w:rPr>
+          <w:rFonts w:ascii="Times New Roman" w:hAnsi="Times New Roman" w:eastAsia="Times New Roman" w:cs="Times New Roman"/>
+          <w:color w:val="000000"/>
+          <w:u w:val="none"/>
+        </w:rPr>
+        <w:t>local-mailbox</w:t>
+      </w:r>
+      <w:r>
+        <w:rPr>
+          <w:rFonts w:ascii="Times New Roman" w:hAnsi="Times New Roman" w:eastAsia="Times New Roman" w:cs="Times New Roman"/>
+          <w:color w:val="000000"/>
+          <w:u w:val="none"/>
+        </w:rPr>
+        <w:t>/</w:t>
+      </w:r>
+      <w:r>
+        <w:rPr>
+          <w:rFonts w:ascii="Times New Roman" w:hAnsi="Times New Roman" w:eastAsia="Times New Roman" w:cs="Times New Roman"/>
+          <w:color w:val="000000"/>
+          <w:u w:val="none"/>
+        </w:rPr>
+        <w:t>smtp</w:t>
+      </w:r>
+      <w:r>
+        <w:rPr>
+          <w:rFonts w:ascii="Times New Roman" w:hAnsi="Times New Roman" w:eastAsia="Times New Roman" w:cs="Times New Roman"/>
+          <w:color w:val="000000"/>
+          <w:u w:val="none"/>
+        </w:rPr>
+        <w:t xml:space="preserve">), </w:t>
+      </w:r>
+      <w:r>
+        <w:rPr>
+          <w:rFonts w:ascii="Times New Roman" w:hAnsi="Times New Roman" w:eastAsia="Times New Roman" w:cs="Times New Roman"/>
+          <w:color w:val="000000"/>
+          <w:u w:val="none"/>
+        </w:rPr>
+        <w:t>delivery</w:t>
+      </w:r>
+      <w:r>
+        <w:rPr>
+          <w:rFonts w:ascii="Times New Roman" w:hAnsi="Times New Roman" w:eastAsia="Times New Roman" w:cs="Times New Roman"/>
+          <w:color w:val="000000"/>
+          <w:u w:val="none"/>
+        </w:rPr>
+        <w:t xml:space="preserve"> (</w:t>
+      </w:r>
+      <w:r>
+        <w:rPr>
+          <w:rFonts w:ascii="Times New Roman" w:hAnsi="Times New Roman" w:eastAsia="Times New Roman" w:cs="Times New Roman"/>
+          <w:color w:val="000000"/>
+          <w:u w:val="none"/>
+        </w:rPr>
+        <w:t>ready</w:t>
+      </w:r>
+      <w:r>
+        <w:rPr>
+          <w:rFonts w:ascii="Times New Roman" w:hAnsi="Times New Roman" w:eastAsia="Times New Roman" w:cs="Times New Roman"/>
+          <w:color w:val="000000"/>
+          <w:u w:val="none"/>
+        </w:rPr>
+        <w:t>/</w:t>
+      </w:r>
+      <w:r>
+        <w:rPr>
+          <w:rFonts w:ascii="Times New Roman" w:hAnsi="Times New Roman" w:eastAsia="Times New Roman" w:cs="Times New Roman"/>
+          <w:color w:val="000000"/>
+          <w:u w:val="none"/>
+        </w:rPr>
+        <w:t>failed</w:t>
+      </w:r>
+      <w:r>
+        <w:rPr>
+          <w:rFonts w:ascii="Times New Roman" w:hAnsi="Times New Roman" w:eastAsia="Times New Roman" w:cs="Times New Roman"/>
+          <w:color w:val="000000"/>
+          <w:u w:val="none"/>
+        </w:rPr>
+        <w:t xml:space="preserve">), </w:t>
+      </w:r>
+      <w:r>
+        <w:rPr>
+          <w:rFonts w:ascii="Times New Roman" w:hAnsi="Times New Roman" w:eastAsia="Times New Roman" w:cs="Times New Roman"/>
+          <w:color w:val="000000"/>
+          <w:u w:val="none"/>
+        </w:rPr>
+        <w:t>demo:true</w:t>
+      </w:r>
+      <w:r>
+        <w:rPr>
+          <w:rFonts w:ascii="Times New Roman" w:hAnsi="Times New Roman" w:eastAsia="Times New Roman" w:cs="Times New Roman"/>
+          <w:color w:val="000000"/>
+          <w:u w:val="none"/>
+        </w:rPr>
+        <w:t xml:space="preserve">. Сбой SMTP не отменяет регистрацию: ссылка уже подготовлена, доставку можно повторить через </w:t>
+      </w:r>
+      <w:r>
+        <w:rPr>
+          <w:rFonts w:ascii="Times New Roman" w:hAnsi="Times New Roman" w:eastAsia="Times New Roman" w:cs="Times New Roman"/>
+          <w:color w:val="000000"/>
+          <w:u w:val="none"/>
+        </w:rPr>
+        <w:t>/auth/login</w:t>
+      </w:r>
+      <w:r>
+        <w:rPr>
+          <w:rFonts w:ascii="Times New Roman" w:hAnsi="Times New Roman" w:eastAsia="Times New Roman" w:cs="Times New Roman"/>
+          <w:color w:val="000000"/>
+          <w:u w:val="none"/>
+        </w:rPr>
+        <w:t>.</w:t>
+      </w:r>
+    </w:p>
+    <w:p>
+      <w:r>
+        <w:rPr>
+          <w:rFonts w:ascii="Times New Roman" w:hAnsi="Times New Roman" w:eastAsia="Times New Roman" w:cs="Times New Roman"/>
+          <w:color w:val="000000"/>
+          <w:u w:val="none"/>
+        </w:rPr>
+        <w:t>GET /auth/mock-mail</w:t>
+      </w:r>
+      <w:r>
+        <w:rPr>
+          <w:rFonts w:ascii="Times New Roman" w:hAnsi="Times New Roman" w:eastAsia="Times New Roman" w:cs="Times New Roman"/>
+          <w:color w:val="000000"/>
+          <w:u w:val="none"/>
+        </w:rPr>
+        <w:t xml:space="preserve"> открыт и содержит одноразовые токены исключительно локальной демонстрационной почты. Срок ссылки — 30 минут. </w:t>
+      </w:r>
+      <w:r>
+        <w:rPr>
+          <w:rFonts w:ascii="Times New Roman" w:hAnsi="Times New Roman" w:eastAsia="Times New Roman" w:cs="Times New Roman"/>
+          <w:color w:val="000000"/>
+          <w:u w:val="none"/>
+        </w:rPr>
+        <w:t>/auth/verify</w:t>
+      </w:r>
+      <w:r>
+        <w:rPr>
+          <w:rFonts w:ascii="Times New Roman" w:hAnsi="Times New Roman" w:eastAsia="Times New Roman" w:cs="Times New Roman"/>
+          <w:color w:val="000000"/>
+          <w:u w:val="none"/>
+        </w:rPr>
+        <w:t xml:space="preserve"> принимает </w:t>
+      </w:r>
+      <w:r>
+        <w:rPr>
+          <w:rFonts w:ascii="Times New Roman" w:hAnsi="Times New Roman" w:eastAsia="Times New Roman" w:cs="Times New Roman"/>
+          <w:color w:val="000000"/>
+          <w:u w:val="none"/>
+        </w:rPr>
+        <w:t>{ "token": "&lt;полученный локально токен&gt;" }</w:t>
+      </w:r>
+      <w:r>
+        <w:rPr>
+          <w:rFonts w:ascii="Times New Roman" w:hAnsi="Times New Roman" w:eastAsia="Times New Roman" w:cs="Times New Roman"/>
+          <w:color w:val="000000"/>
+          <w:u w:val="none"/>
+        </w:rPr>
+        <w:t xml:space="preserve">, подтверждает адрес и создаёт сессию; повторное/просроченное подтверждение — 409. </w:t>
+      </w:r>
+      <w:r>
+        <w:rPr>
+          <w:rFonts w:ascii="Times New Roman" w:hAnsi="Times New Roman" w:eastAsia="Times New Roman" w:cs="Times New Roman"/>
+          <w:color w:val="000000"/>
+          <w:u w:val="none"/>
+        </w:rPr>
+        <w:t>/auth/password-login</w:t>
+      </w:r>
+      <w:r>
+        <w:rPr>
+          <w:rFonts w:ascii="Times New Roman" w:hAnsi="Times New Roman" w:eastAsia="Times New Roman" w:cs="Times New Roman"/>
+          <w:color w:val="000000"/>
+          <w:u w:val="none"/>
+        </w:rPr>
+        <w:t xml:space="preserve"> принимает </w:t>
+      </w:r>
+      <w:r>
+        <w:rPr>
+          <w:rFonts w:ascii="Times New Roman" w:hAnsi="Times New Roman" w:eastAsia="Times New Roman" w:cs="Times New Roman"/>
+          <w:color w:val="000000"/>
+          <w:u w:val="none"/>
+        </w:rPr>
+        <w:t>email/password</w:t>
+      </w:r>
+      <w:r>
+        <w:rPr>
+          <w:rFonts w:ascii="Times New Roman" w:hAnsi="Times New Roman" w:eastAsia="Times New Roman" w:cs="Times New Roman"/>
+          <w:color w:val="000000"/>
+          <w:u w:val="none"/>
+        </w:rPr>
+        <w:t>, требует подтверждённого адреса; неправильные данные — 401, неподтверждённый адрес — 403. Внешнее владение реальным email эта открытая demo-почта не доказывает.</w:t>
+      </w:r>
+    </w:p>
+    <w:p>
+      <w:r>
+        <w:rPr>
+          <w:rFonts w:ascii="Times New Roman" w:hAnsi="Times New Roman" w:eastAsia="Times New Roman" w:cs="Times New Roman"/>
+          <w:color w:val="000000"/>
+          <w:u w:val="none"/>
+        </w:rPr>
+        <w:t>PUT /candidate/profile</w:t>
+      </w:r>
+      <w:r>
+        <w:rPr>
+          <w:rFonts w:ascii="Times New Roman" w:hAnsi="Times New Roman" w:eastAsia="Times New Roman" w:cs="Times New Roman"/>
+          <w:color w:val="000000"/>
+          <w:u w:val="none"/>
+        </w:rPr>
+        <w:t xml:space="preserve"> — полная замена редактируемых полей </w:t>
+      </w:r>
+      <w:r>
+        <w:rPr>
+          <w:rFonts w:ascii="Times New Roman" w:hAnsi="Times New Roman" w:eastAsia="Times New Roman" w:cs="Times New Roman"/>
+          <w:color w:val="000000"/>
+          <w:u w:val="none"/>
+        </w:rPr>
+        <w:t>ProfileInput</w:t>
+      </w:r>
+      <w:r>
+        <w:rPr>
+          <w:rFonts w:ascii="Times New Roman" w:hAnsi="Times New Roman" w:eastAsia="Times New Roman" w:cs="Times New Roman"/>
+          <w:color w:val="000000"/>
+          <w:u w:val="none"/>
+        </w:rPr>
+        <w:t xml:space="preserve">, не PATCH. Клиент задаёт </w:t>
+      </w:r>
+      <w:r>
+        <w:rPr>
+          <w:rFonts w:ascii="Times New Roman" w:hAnsi="Times New Roman" w:eastAsia="Times New Roman" w:cs="Times New Roman"/>
+          <w:color w:val="000000"/>
+          <w:u w:val="none"/>
+        </w:rPr>
+        <w:t>claimed_grade</w:t>
+      </w:r>
+      <w:r>
+        <w:rPr>
+          <w:rFonts w:ascii="Times New Roman" w:hAnsi="Times New Roman" w:eastAsia="Times New Roman" w:cs="Times New Roman"/>
+          <w:color w:val="000000"/>
+          <w:u w:val="none"/>
+        </w:rPr>
+        <w:t xml:space="preserve">, а не </w:t>
+      </w:r>
+      <w:r>
+        <w:rPr>
+          <w:rFonts w:ascii="Times New Roman" w:hAnsi="Times New Roman" w:eastAsia="Times New Roman" w:cs="Times New Roman"/>
+          <w:color w:val="000000"/>
+          <w:u w:val="none"/>
+        </w:rPr>
+        <w:t>confirmed_grade</w:t>
+      </w:r>
+      <w:r>
+        <w:rPr>
+          <w:rFonts w:ascii="Times New Roman" w:hAnsi="Times New Roman" w:eastAsia="Times New Roman" w:cs="Times New Roman"/>
+          <w:color w:val="000000"/>
+          <w:u w:val="none"/>
+        </w:rPr>
+        <w:t xml:space="preserve">, </w:t>
+      </w:r>
+      <w:r>
+        <w:rPr>
+          <w:rFonts w:ascii="Times New Roman" w:hAnsi="Times New Roman" w:eastAsia="Times New Roman" w:cs="Times New Roman"/>
+          <w:color w:val="000000"/>
+          <w:u w:val="none"/>
+        </w:rPr>
+        <w:t>skills</w:t>
+      </w:r>
+      <w:r>
+        <w:rPr>
+          <w:rFonts w:ascii="Times New Roman" w:hAnsi="Times New Roman" w:eastAsia="Times New Roman" w:cs="Times New Roman"/>
+          <w:color w:val="000000"/>
+          <w:u w:val="none"/>
+        </w:rPr>
+        <w:t xml:space="preserve"> или </w:t>
+      </w:r>
+      <w:r>
+        <w:rPr>
+          <w:rFonts w:ascii="Times New Roman" w:hAnsi="Times New Roman" w:eastAsia="Times New Roman" w:cs="Times New Roman"/>
+          <w:color w:val="000000"/>
+          <w:u w:val="none"/>
+        </w:rPr>
+        <w:t>test_score</w:t>
+      </w:r>
+      <w:r>
+        <w:rPr>
+          <w:rFonts w:ascii="Times New Roman" w:hAnsi="Times New Roman" w:eastAsia="Times New Roman" w:cs="Times New Roman"/>
+          <w:color w:val="000000"/>
+          <w:u w:val="none"/>
+        </w:rPr>
+        <w:t xml:space="preserve">. </w:t>
+      </w:r>
+      <w:r>
+        <w:rPr>
+          <w:rFonts w:ascii="Times New Roman" w:hAnsi="Times New Roman" w:eastAsia="Times New Roman" w:cs="Times New Roman"/>
+          <w:color w:val="000000"/>
+          <w:u w:val="none"/>
+        </w:rPr>
+        <w:t>industry=it</w:t>
+      </w:r>
+      <w:r>
+        <w:rPr>
+          <w:rFonts w:ascii="Times New Roman" w:hAnsi="Times New Roman" w:eastAsia="Times New Roman" w:cs="Times New Roman"/>
+          <w:color w:val="000000"/>
+          <w:u w:val="none"/>
+        </w:rPr>
+        <w:t xml:space="preserve">; специализации </w:t>
+      </w:r>
+      <w:r>
+        <w:rPr>
+          <w:rFonts w:ascii="Times New Roman" w:hAnsi="Times New Roman" w:eastAsia="Times New Roman" w:cs="Times New Roman"/>
+          <w:color w:val="000000"/>
+          <w:u w:val="none"/>
+        </w:rPr>
+        <w:t>backend/frontend/qa</w:t>
+      </w:r>
+      <w:r>
+        <w:rPr>
+          <w:rFonts w:ascii="Times New Roman" w:hAnsi="Times New Roman" w:eastAsia="Times New Roman" w:cs="Times New Roman"/>
+          <w:color w:val="000000"/>
+          <w:u w:val="none"/>
+        </w:rPr>
+        <w:t xml:space="preserve">, грейды </w:t>
+      </w:r>
+      <w:r>
+        <w:rPr>
+          <w:rFonts w:ascii="Times New Roman" w:hAnsi="Times New Roman" w:eastAsia="Times New Roman" w:cs="Times New Roman"/>
+          <w:color w:val="000000"/>
+          <w:u w:val="none"/>
+        </w:rPr>
+        <w:t>junior/middle</w:t>
+      </w:r>
+      <w:r>
+        <w:rPr>
+          <w:rFonts w:ascii="Times New Roman" w:hAnsi="Times New Roman" w:eastAsia="Times New Roman" w:cs="Times New Roman"/>
+          <w:color w:val="000000"/>
+          <w:u w:val="none"/>
+        </w:rPr>
+        <w:t xml:space="preserve">, формат </w:t>
+      </w:r>
+      <w:r>
+        <w:rPr>
+          <w:rFonts w:ascii="Times New Roman" w:hAnsi="Times New Roman" w:eastAsia="Times New Roman" w:cs="Times New Roman"/>
+          <w:color w:val="000000"/>
+          <w:u w:val="none"/>
+        </w:rPr>
+        <w:t>remote/hybrid/office</w:t>
+      </w:r>
+      <w:r>
+        <w:rPr>
+          <w:rFonts w:ascii="Times New Roman" w:hAnsi="Times New Roman" w:eastAsia="Times New Roman" w:cs="Times New Roman"/>
+          <w:color w:val="000000"/>
+          <w:u w:val="none"/>
+        </w:rPr>
+        <w:t xml:space="preserve">. Строгие целые зарплаты указаны в RUB. Резюме содержит </w:t>
+      </w:r>
+      <w:r>
+        <w:rPr>
+          <w:rFonts w:ascii="Times New Roman" w:hAnsi="Times New Roman" w:eastAsia="Times New Roman" w:cs="Times New Roman"/>
+          <w:color w:val="000000"/>
+          <w:u w:val="none"/>
+        </w:rPr>
+        <w:t>full_name</w:t>
+      </w:r>
+      <w:r>
+        <w:rPr>
+          <w:rFonts w:ascii="Times New Roman" w:hAnsi="Times New Roman" w:eastAsia="Times New Roman" w:cs="Times New Roman"/>
+          <w:color w:val="000000"/>
+          <w:u w:val="none"/>
+        </w:rPr>
+        <w:t xml:space="preserve">, </w:t>
+      </w:r>
+      <w:r>
+        <w:rPr>
+          <w:rFonts w:ascii="Times New Roman" w:hAnsi="Times New Roman" w:eastAsia="Times New Roman" w:cs="Times New Roman"/>
+          <w:color w:val="000000"/>
+          <w:u w:val="none"/>
+        </w:rPr>
+        <w:t>years_experience</w:t>
+      </w:r>
+      <w:r>
+        <w:rPr>
+          <w:rFonts w:ascii="Times New Roman" w:hAnsi="Times New Roman" w:eastAsia="Times New Roman" w:cs="Times New Roman"/>
+          <w:color w:val="000000"/>
+          <w:u w:val="none"/>
+        </w:rPr>
+        <w:t xml:space="preserve">, </w:t>
+      </w:r>
+      <w:r>
+        <w:rPr>
+          <w:rFonts w:ascii="Times New Roman" w:hAnsi="Times New Roman" w:eastAsia="Times New Roman" w:cs="Times New Roman"/>
+          <w:color w:val="000000"/>
+          <w:u w:val="none"/>
+        </w:rPr>
+        <w:t>roles</w:t>
+      </w:r>
+      <w:r>
+        <w:rPr>
+          <w:rFonts w:ascii="Times New Roman" w:hAnsi="Times New Roman" w:eastAsia="Times New Roman" w:cs="Times New Roman"/>
+          <w:color w:val="000000"/>
+          <w:u w:val="none"/>
+        </w:rPr>
+        <w:t xml:space="preserve">, </w:t>
+      </w:r>
+      <w:r>
+        <w:rPr>
+          <w:rFonts w:ascii="Times New Roman" w:hAnsi="Times New Roman" w:eastAsia="Times New Roman" w:cs="Times New Roman"/>
+          <w:color w:val="000000"/>
+          <w:u w:val="none"/>
+        </w:rPr>
+        <w:t>soft_skills</w:t>
+      </w:r>
+      <w:r>
+        <w:rPr>
+          <w:rFonts w:ascii="Times New Roman" w:hAnsi="Times New Roman" w:eastAsia="Times New Roman" w:cs="Times New Roman"/>
+          <w:color w:val="000000"/>
+          <w:u w:val="none"/>
+        </w:rPr>
+        <w:t xml:space="preserve">, </w:t>
+      </w:r>
+      <w:r>
+        <w:rPr>
+          <w:rFonts w:ascii="Times New Roman" w:hAnsi="Times New Roman" w:eastAsia="Times New Roman" w:cs="Times New Roman"/>
+          <w:color w:val="000000"/>
+          <w:u w:val="none"/>
+        </w:rPr>
+        <w:t>education</w:t>
+      </w:r>
+      <w:r>
+        <w:rPr>
+          <w:rFonts w:ascii="Times New Roman" w:hAnsi="Times New Roman" w:eastAsia="Times New Roman" w:cs="Times New Roman"/>
+          <w:color w:val="000000"/>
+          <w:u w:val="none"/>
+        </w:rPr>
+        <w:t xml:space="preserve">, </w:t>
+      </w:r>
+      <w:r>
+        <w:rPr>
+          <w:rFonts w:ascii="Times New Roman" w:hAnsi="Times New Roman" w:eastAsia="Times New Roman" w:cs="Times New Roman"/>
+          <w:color w:val="000000"/>
+          <w:u w:val="none"/>
+        </w:rPr>
+        <w:t>about</w:t>
+      </w:r>
+      <w:r>
+        <w:rPr>
+          <w:rFonts w:ascii="Times New Roman" w:hAnsi="Times New Roman" w:eastAsia="Times New Roman" w:cs="Times New Roman"/>
+          <w:color w:val="000000"/>
+          <w:u w:val="none"/>
+        </w:rPr>
+        <w:t xml:space="preserve">, </w:t>
+      </w:r>
+      <w:r>
+        <w:rPr>
+          <w:rFonts w:ascii="Times New Roman" w:hAnsi="Times New Roman" w:eastAsia="Times New Roman" w:cs="Times New Roman"/>
+          <w:color w:val="000000"/>
+          <w:u w:val="none"/>
+        </w:rPr>
+        <w:t>declared_skills</w:t>
+      </w:r>
+      <w:r>
+        <w:rPr>
+          <w:rFonts w:ascii="Times New Roman" w:hAnsi="Times New Roman" w:eastAsia="Times New Roman" w:cs="Times New Roman"/>
+          <w:color w:val="000000"/>
+          <w:u w:val="none"/>
+        </w:rPr>
+        <w:t xml:space="preserve">; заполнение не подтверждает компетентность. </w:t>
+      </w:r>
+      <w:r>
+        <w:rPr>
+          <w:rFonts w:ascii="Times New Roman" w:hAnsi="Times New Roman" w:eastAsia="Times New Roman" w:cs="Times New Roman"/>
+          <w:color w:val="000000"/>
+          <w:u w:val="none"/>
+        </w:rPr>
+        <w:t>resume.declared_skills</w:t>
+      </w:r>
+      <w:r>
+        <w:rPr>
+          <w:rFonts w:ascii="Times New Roman" w:hAnsi="Times New Roman" w:eastAsia="Times New Roman" w:cs="Times New Roman"/>
+          <w:color w:val="000000"/>
+          <w:u w:val="none"/>
+        </w:rPr>
+        <w:t xml:space="preserve"> — до 20 ID технологий из </w:t>
+      </w:r>
+      <w:r>
+        <w:rPr>
+          <w:rFonts w:ascii="Times New Roman" w:hAnsi="Times New Roman" w:eastAsia="Times New Roman" w:cs="Times New Roman"/>
+          <w:color w:val="000000"/>
+          <w:u w:val="none"/>
+        </w:rPr>
+        <w:t>declared_skills</w:t>
+      </w:r>
+      <w:r>
+        <w:rPr>
+          <w:rFonts w:ascii="Times New Roman" w:hAnsi="Times New Roman" w:eastAsia="Times New Roman" w:cs="Times New Roman"/>
+          <w:color w:val="000000"/>
+          <w:u w:val="none"/>
+        </w:rPr>
+        <w:t xml:space="preserve"> ответа </w:t>
+      </w:r>
+      <w:r>
+        <w:rPr>
+          <w:rFonts w:ascii="Times New Roman" w:hAnsi="Times New Roman" w:eastAsia="Times New Roman" w:cs="Times New Roman"/>
+          <w:color w:val="000000"/>
+          <w:u w:val="none"/>
+        </w:rPr>
+        <w:t>/catalog</w:t>
+      </w:r>
+      <w:r>
+        <w:rPr>
+          <w:rFonts w:ascii="Times New Roman" w:hAnsi="Times New Roman" w:eastAsia="Times New Roman" w:cs="Times New Roman"/>
+          <w:color w:val="000000"/>
+          <w:u w:val="none"/>
+        </w:rPr>
+        <w:t xml:space="preserve">, по умолчанию </w:t>
+      </w:r>
+      <w:r>
+        <w:rPr>
+          <w:rFonts w:ascii="Times New Roman" w:hAnsi="Times New Roman" w:eastAsia="Times New Roman" w:cs="Times New Roman"/>
+          <w:color w:val="000000"/>
+          <w:u w:val="none"/>
+        </w:rPr>
+        <w:t>[]</w:t>
+      </w:r>
+      <w:r>
+        <w:rPr>
+          <w:rFonts w:ascii="Times New Roman" w:hAnsi="Times New Roman" w:eastAsia="Times New Roman" w:cs="Times New Roman"/>
+          <w:color w:val="000000"/>
+          <w:u w:val="none"/>
+        </w:rPr>
+        <w:t xml:space="preserve">. Повторы удаляются с сохранением порядка, неизвестный ID даёт 422. При полном PUT передавайте текущий список, чтобы сохранить заявления. React/Vue/Go/Java можно заявить, но оценочная категория остаётся одной из трёх доступных специализаций; заявление не обновляет </w:t>
+      </w:r>
+      <w:r>
+        <w:rPr>
+          <w:rFonts w:ascii="Times New Roman" w:hAnsi="Times New Roman" w:eastAsia="Times New Roman" w:cs="Times New Roman"/>
+          <w:color w:val="000000"/>
+          <w:u w:val="none"/>
+        </w:rPr>
+        <w:t>skills</w:t>
+      </w:r>
+      <w:r>
+        <w:rPr>
+          <w:rFonts w:ascii="Times New Roman" w:hAnsi="Times New Roman" w:eastAsia="Times New Roman" w:cs="Times New Roman"/>
+          <w:color w:val="000000"/>
+          <w:u w:val="none"/>
+        </w:rPr>
+        <w:t>, балл или публикацию. Смена специализации снимает публикацию и переключает подтверждённый результат на историю выбранного направления, не переносит квалификацию из другого.</w:t>
+      </w:r>
+    </w:p>
+    <w:p>
+      <w:r>
+        <w:rPr>
+          <w:rFonts w:ascii="Times New Roman" w:hAnsi="Times New Roman" w:eastAsia="Times New Roman" w:cs="Times New Roman"/>
+          <w:color w:val="000000"/>
+          <w:u w:val="none"/>
+        </w:rPr>
+        <w:t>POST /candidate/resume-preview</w:t>
+      </w:r>
+      <w:r>
+        <w:rPr>
+          <w:rFonts w:ascii="Times New Roman" w:hAnsi="Times New Roman" w:eastAsia="Times New Roman" w:cs="Times New Roman"/>
+          <w:color w:val="000000"/>
+          <w:u w:val="none"/>
+        </w:rPr>
+        <w:t xml:space="preserve"> принимает </w:t>
+      </w:r>
+      <w:r>
+        <w:rPr>
+          <w:rFonts w:ascii="Times New Roman" w:hAnsi="Times New Roman" w:eastAsia="Times New Roman" w:cs="Times New Roman"/>
+          <w:b/>
+          <w:color w:val="000000"/>
+          <w:u w:val="none"/>
+        </w:rPr>
+        <w:t>сам PDF в теле</w:t>
+      </w:r>
+      <w:r>
+        <w:rPr>
+          <w:rFonts w:ascii="Times New Roman" w:hAnsi="Times New Roman" w:eastAsia="Times New Roman" w:cs="Times New Roman"/>
+          <w:color w:val="000000"/>
+          <w:u w:val="none"/>
+        </w:rPr>
+        <w:t xml:space="preserve">, </w:t>
+      </w:r>
+      <w:r>
+        <w:rPr>
+          <w:rFonts w:ascii="Times New Roman" w:hAnsi="Times New Roman" w:eastAsia="Times New Roman" w:cs="Times New Roman"/>
+          <w:color w:val="000000"/>
+          <w:u w:val="none"/>
+        </w:rPr>
+        <w:t>Content-Type: application/pdf</w:t>
+      </w:r>
+      <w:r>
+        <w:rPr>
+          <w:rFonts w:ascii="Times New Roman" w:hAnsi="Times New Roman" w:eastAsia="Times New Roman" w:cs="Times New Roman"/>
+          <w:color w:val="000000"/>
+          <w:u w:val="none"/>
+        </w:rPr>
+        <w:t xml:space="preserve">, до 2 MiB. Это не multipart/form-data. Ответ </w:t>
+      </w:r>
+      <w:r>
+        <w:rPr>
+          <w:rFonts w:ascii="Times New Roman" w:hAnsi="Times New Roman" w:eastAsia="Times New Roman" w:cs="Times New Roman"/>
+          <w:color w:val="000000"/>
+          <w:u w:val="none"/>
+        </w:rPr>
+        <w:t>ResumePreviewView</w:t>
+      </w:r>
+      <w:r>
+        <w:rPr>
+          <w:rFonts w:ascii="Times New Roman" w:hAnsi="Times New Roman" w:eastAsia="Times New Roman" w:cs="Times New Roman"/>
+          <w:color w:val="000000"/>
+          <w:u w:val="none"/>
+        </w:rPr>
+        <w:t xml:space="preserve"> предлагает </w:t>
+      </w:r>
+      <w:r>
+        <w:rPr>
+          <w:rFonts w:ascii="Times New Roman" w:hAnsi="Times New Roman" w:eastAsia="Times New Roman" w:cs="Times New Roman"/>
+          <w:color w:val="000000"/>
+          <w:u w:val="none"/>
+        </w:rPr>
+        <w:t>resume</w:t>
+      </w:r>
+      <w:r>
+        <w:rPr>
+          <w:rFonts w:ascii="Times New Roman" w:hAnsi="Times New Roman" w:eastAsia="Times New Roman" w:cs="Times New Roman"/>
+          <w:color w:val="000000"/>
+          <w:u w:val="none"/>
+        </w:rPr>
+        <w:t xml:space="preserve">, </w:t>
+      </w:r>
+      <w:r>
+        <w:rPr>
+          <w:rFonts w:ascii="Times New Roman" w:hAnsi="Times New Roman" w:eastAsia="Times New Roman" w:cs="Times New Roman"/>
+          <w:color w:val="000000"/>
+          <w:u w:val="none"/>
+        </w:rPr>
+        <w:t>contact</w:t>
+      </w:r>
+      <w:r>
+        <w:rPr>
+          <w:rFonts w:ascii="Times New Roman" w:hAnsi="Times New Roman" w:eastAsia="Times New Roman" w:cs="Times New Roman"/>
+          <w:color w:val="000000"/>
+          <w:u w:val="none"/>
+        </w:rPr>
+        <w:t xml:space="preserve">, </w:t>
+      </w:r>
+      <w:r>
+        <w:rPr>
+          <w:rFonts w:ascii="Times New Roman" w:hAnsi="Times New Roman" w:eastAsia="Times New Roman" w:cs="Times New Roman"/>
+          <w:color w:val="000000"/>
+          <w:u w:val="none"/>
+        </w:rPr>
+        <w:t>specialization</w:t>
+      </w:r>
+      <w:r>
+        <w:rPr>
+          <w:rFonts w:ascii="Times New Roman" w:hAnsi="Times New Roman" w:eastAsia="Times New Roman" w:cs="Times New Roman"/>
+          <w:color w:val="000000"/>
+          <w:u w:val="none"/>
+        </w:rPr>
+        <w:t xml:space="preserve">, </w:t>
+      </w:r>
+      <w:r>
+        <w:rPr>
+          <w:rFonts w:ascii="Times New Roman" w:hAnsi="Times New Roman" w:eastAsia="Times New Roman" w:cs="Times New Roman"/>
+          <w:color w:val="000000"/>
+          <w:u w:val="none"/>
+        </w:rPr>
+        <w:t>claimed_grade</w:t>
+      </w:r>
+      <w:r>
+        <w:rPr>
+          <w:rFonts w:ascii="Times New Roman" w:hAnsi="Times New Roman" w:eastAsia="Times New Roman" w:cs="Times New Roman"/>
+          <w:color w:val="000000"/>
+          <w:u w:val="none"/>
+        </w:rPr>
+        <w:t xml:space="preserve">, </w:t>
+      </w:r>
+      <w:r>
+        <w:rPr>
+          <w:rFonts w:ascii="Times New Roman" w:hAnsi="Times New Roman" w:eastAsia="Times New Roman" w:cs="Times New Roman"/>
+          <w:color w:val="000000"/>
+          <w:u w:val="none"/>
+        </w:rPr>
+        <w:t>claimed_skills</w:t>
+      </w:r>
+      <w:r>
+        <w:rPr>
+          <w:rFonts w:ascii="Times New Roman" w:hAnsi="Times New Roman" w:eastAsia="Times New Roman" w:cs="Times New Roman"/>
+          <w:color w:val="000000"/>
+          <w:u w:val="none"/>
+        </w:rPr>
+        <w:t xml:space="preserve">, </w:t>
+      </w:r>
+      <w:r>
+        <w:rPr>
+          <w:rFonts w:ascii="Times New Roman" w:hAnsi="Times New Roman" w:eastAsia="Times New Roman" w:cs="Times New Roman"/>
+          <w:color w:val="000000"/>
+          <w:u w:val="none"/>
+        </w:rPr>
+        <w:t>warnings</w:t>
+      </w:r>
+      <w:r>
+        <w:rPr>
+          <w:rFonts w:ascii="Times New Roman" w:hAnsi="Times New Roman" w:eastAsia="Times New Roman" w:cs="Times New Roman"/>
+          <w:color w:val="000000"/>
+          <w:u w:val="none"/>
+        </w:rPr>
+        <w:t xml:space="preserve">, </w:t>
+      </w:r>
+      <w:r>
+        <w:rPr>
+          <w:rFonts w:ascii="Times New Roman" w:hAnsi="Times New Roman" w:eastAsia="Times New Roman" w:cs="Times New Roman"/>
+          <w:color w:val="000000"/>
+          <w:u w:val="none"/>
+        </w:rPr>
+        <w:t>demo</w:t>
+      </w:r>
+      <w:r>
+        <w:rPr>
+          <w:rFonts w:ascii="Times New Roman" w:hAnsi="Times New Roman" w:eastAsia="Times New Roman" w:cs="Times New Roman"/>
+          <w:color w:val="000000"/>
+          <w:u w:val="none"/>
+        </w:rPr>
+        <w:t>. Предпросмотр ничего не сохраняет: пользователь подтверждает поля отдельным PUT профиля. Парсинг эвристический, для текстового PDF, без OCR; ошибки/timeout — 422, слишком большой файл — 413, неправильный Content-Type — 415.</w:t>
+      </w:r>
+    </w:p>
+    <w:p>
+      <w:pPr>
+        <w:pStyle w:val="Heading2"/>
+      </w:pPr>
+      <w:r>
+        <w:rPr>
+          <w:rFonts w:ascii="Times New Roman" w:hAnsi="Times New Roman" w:eastAsia="Times New Roman" w:cs="Times New Roman"/>
+          <w:color w:val="000000"/>
+          <w:u w:val="none"/>
+        </w:rPr>
+        <w:t>5. Каталог и основания навыков</w:t>
       </w:r>
     </w:p>
     <w:p>
@@ -2677,7 +2998,7 @@
           <w:color w:val="000000"/>
           <w:u w:val="none"/>
         </w:rPr>
-        <w:t>5. Обязательная оценка, категория и публикация</w:t>
+        <w:t>6. Обязательная оценка, категория и публикация</w:t>
       </w:r>
     </w:p>
     <w:p>
@@ -4102,7 +4423,7 @@
           <w:color w:val="000000"/>
           <w:u w:val="none"/>
         </w:rPr>
-        <w:t>6. Подбор, предложение и контакт — основной сценарий ТЗ</w:t>
+        <w:t>7. Подбор, предложение и контакт — основной сценарий ТЗ</w:t>
       </w:r>
     </w:p>
     <w:p>
@@ -5394,7 +5715,7 @@
           <w:color w:val="000000"/>
           <w:u w:val="none"/>
         </w:rPr>
-        <w:t>7. Вакансии, самостоятельный отклик и короткие задания</w:t>
+        <w:t>8. Вакансии, самостоятельный отклик и короткие задания</w:t>
       </w:r>
     </w:p>
     <w:p>
@@ -5712,7 +6033,7 @@
           <w:color w:val="000000"/>
           <w:u w:val="none"/>
         </w:rPr>
-        <w:t>8. Конструктор, публикации и импорт</w:t>
+        <w:t>9. Конструктор, публикации и импорт</w:t>
       </w:r>
     </w:p>
     <w:p>
@@ -7492,7 +7813,7 @@
           <w:color w:val="000000"/>
           <w:u w:val="none"/>
         </w:rPr>
-        <w:t>9. Выполнение банка и очередь VM</w:t>
+        <w:t>10. Выполнение банка и очередь VM</w:t>
       </w:r>
     </w:p>
     <w:p>
@@ -8382,7 +8703,7 @@
           <w:color w:val="000000"/>
           <w:u w:val="none"/>
         </w:rPr>
-        <w:t>10. Ошибки и форматы</w:t>
+        <w:t>11. Ошибки и форматы</w:t>
       </w:r>
     </w:p>
     <w:p>
@@ -9076,7 +9397,7 @@
           <w:color w:val="000000"/>
           <w:u w:val="none"/>
         </w:rPr>
-        <w:t>11. ФСП ID mock и исходное ТЗ</w:t>
+        <w:t>12. ФСП ID mock и исходное ТЗ</w:t>
       </w:r>
     </w:p>
     <w:p>
@@ -9460,7 +9781,7 @@
           <w:color w:val="000000"/>
           <w:u w:val="none"/>
         </w:rPr>
-        <w:t>12. Полный справочник операций</w:t>
+        <w:t>13. Полный справочник операций</w:t>
       </w:r>
     </w:p>
     <w:p>
@@ -9531,7 +9852,7 @@
           <w:color w:val="000000"/>
           <w:u w:val="none"/>
         </w:rPr>
-        <w:t>12.1. Состояние</w:t>
+        <w:t>13.1. Состояние</w:t>
       </w:r>
     </w:p>
     <w:p>
@@ -9793,7 +10114,7 @@
           <w:color w:val="000000"/>
           <w:u w:val="none"/>
         </w:rPr>
-        <w:t>12.2. Mock-идентификация</w:t>
+        <w:t>13.2. Mock-идентификация</w:t>
       </w:r>
     </w:p>
     <w:p>
@@ -10463,7 +10784,7 @@
           <w:color w:val="000000"/>
           <w:u w:val="none"/>
         </w:rPr>
-        <w:t>12.3. Вход</w:t>
+        <w:t>13.3. Вход</w:t>
       </w:r>
     </w:p>
     <w:p>
@@ -10515,7 +10836,7 @@
         </w:trPr>
         <w:tc>
           <w:tcPr>
-            <w:tcW w:type="dxa" w:w="687"/>
+            <w:tcW w:type="dxa" w:w="645"/>
             <w:vAlign w:val="center"/>
           </w:tcPr>
           <w:p>
@@ -10538,7 +10859,7 @@
         </w:tc>
         <w:tc>
           <w:tcPr>
-            <w:tcW w:type="dxa" w:w="2317"/>
+            <w:tcW w:type="dxa" w:w="2177"/>
             <w:vAlign w:val="center"/>
           </w:tcPr>
           <w:p>
@@ -10561,7 +10882,7 @@
         </w:tc>
         <w:tc>
           <w:tcPr>
-            <w:tcW w:type="dxa" w:w="3519"/>
+            <w:tcW w:type="dxa" w:w="3871"/>
             <w:vAlign w:val="center"/>
           </w:tcPr>
           <w:p>
@@ -10584,7 +10905,7 @@
         </w:tc>
         <w:tc>
           <w:tcPr>
-            <w:tcW w:type="dxa" w:w="2832"/>
+            <w:tcW w:type="dxa" w:w="2661"/>
             <w:vAlign w:val="center"/>
           </w:tcPr>
           <w:p>
@@ -10612,7 +10933,7 @@
         </w:trPr>
         <w:tc>
           <w:tcPr>
-            <w:tcW w:type="dxa" w:w="687"/>
+            <w:tcW w:type="dxa" w:w="645"/>
             <w:vAlign w:val="center"/>
           </w:tcPr>
           <w:p>
@@ -10634,7 +10955,7 @@
         </w:tc>
         <w:tc>
           <w:tcPr>
-            <w:tcW w:type="dxa" w:w="2317"/>
+            <w:tcW w:type="dxa" w:w="2177"/>
             <w:vAlign w:val="center"/>
           </w:tcPr>
           <w:p>
@@ -10656,7 +10977,7 @@
         </w:tc>
         <w:tc>
           <w:tcPr>
-            <w:tcW w:type="dxa" w:w="3519"/>
+            <w:tcW w:type="dxa" w:w="3871"/>
             <w:vAlign w:val="center"/>
           </w:tcPr>
           <w:p>
@@ -10678,7 +10999,7 @@
         </w:tc>
         <w:tc>
           <w:tcPr>
-            <w:tcW w:type="dxa" w:w="2832"/>
+            <w:tcW w:type="dxa" w:w="2661"/>
             <w:vAlign w:val="center"/>
           </w:tcPr>
           <w:p>
@@ -10704,6 +11025,108 @@
                 <w:u w:val="none"/>
               </w:rPr>
               <w:t xml:space="preserve"> → 200 / SessionView</w:t>
+            </w:r>
+          </w:p>
+        </w:tc>
+      </w:tr>
+      <w:tr>
+        <w:trPr>
+          <w:cantSplit/>
+        </w:trPr>
+        <w:tc>
+          <w:tcPr>
+            <w:tcW w:type="dxa" w:w="645"/>
+            <w:vAlign w:val="center"/>
+          </w:tcPr>
+          <w:p>
+            <w:pPr>
+              <w:spacing w:line="240" w:lineRule="auto" w:before="0" w:after="0"/>
+              <w:ind w:firstLine="0"/>
+              <w:jc w:val="left"/>
+            </w:pPr>
+            <w:r>
+              <w:rPr>
+                <w:rFonts w:ascii="Times New Roman" w:hAnsi="Times New Roman" w:eastAsia="Times New Roman" w:cs="Times New Roman"/>
+                <w:color w:val="000000"/>
+                <w:sz w:val="24"/>
+                <w:u w:val="none"/>
+              </w:rPr>
+              <w:t>POST</w:t>
+            </w:r>
+          </w:p>
+        </w:tc>
+        <w:tc>
+          <w:tcPr>
+            <w:tcW w:type="dxa" w:w="2177"/>
+            <w:vAlign w:val="center"/>
+          </w:tcPr>
+          <w:p>
+            <w:pPr>
+              <w:spacing w:line="240" w:lineRule="auto" w:before="0" w:after="0"/>
+              <w:ind w:firstLine="0"/>
+              <w:jc w:val="left"/>
+            </w:pPr>
+            <w:r>
+              <w:rPr>
+                <w:rFonts w:ascii="Times New Roman" w:hAnsi="Times New Roman" w:eastAsia="Times New Roman" w:cs="Times New Roman"/>
+                <w:color w:val="000000"/>
+                <w:sz w:val="24"/>
+                <w:u w:val="none"/>
+              </w:rPr>
+              <w:t>/api/v1/auth/jury-register</w:t>
+            </w:r>
+          </w:p>
+        </w:tc>
+        <w:tc>
+          <w:tcPr>
+            <w:tcW w:type="dxa" w:w="3871"/>
+            <w:vAlign w:val="center"/>
+          </w:tcPr>
+          <w:p>
+            <w:pPr>
+              <w:spacing w:line="240" w:lineRule="auto" w:before="0" w:after="0"/>
+              <w:ind w:firstLine="0"/>
+              <w:jc w:val="left"/>
+            </w:pPr>
+            <w:r>
+              <w:rPr>
+                <w:rFonts w:ascii="Times New Roman" w:hAnsi="Times New Roman" w:eastAsia="Times New Roman" w:cs="Times New Roman"/>
+                <w:color w:val="000000"/>
+                <w:sz w:val="24"/>
+                <w:u w:val="none"/>
+              </w:rPr>
+              <w:t>П — Индивидуальный синтетический аккаунт, только opt-in jury</w:t>
+            </w:r>
+          </w:p>
+        </w:tc>
+        <w:tc>
+          <w:tcPr>
+            <w:tcW w:type="dxa" w:w="2661"/>
+            <w:vAlign w:val="center"/>
+          </w:tcPr>
+          <w:p>
+            <w:pPr>
+              <w:spacing w:line="240" w:lineRule="auto" w:before="0" w:after="0"/>
+              <w:ind w:firstLine="0"/>
+              <w:jc w:val="left"/>
+            </w:pPr>
+            <w:r>
+              <w:rPr>
+                <w:rFonts w:ascii="Times New Roman" w:hAnsi="Times New Roman" w:eastAsia="Times New Roman" w:cs="Times New Roman"/>
+                <w:color w:val="000000"/>
+                <w:sz w:val="24"/>
+                <w:u w:val="none"/>
+              </w:rPr>
+              <w:t>JuryRegister</w:t>
+            </w:r>
+            <w:r>
+              <w:rPr>
+                <w:rFonts w:ascii="Times New Roman" w:hAnsi="Times New Roman" w:eastAsia="Times New Roman" w:cs="Times New Roman"/>
+                <w:color w:val="000000"/>
+                <w:sz w:val="24"/>
+                <w:u w:val="none"/>
+              </w:rPr>
+              <w:t xml:space="preserve"> → 201 / JurySession</w:t>
             </w:r>
           </w:p>
         </w:tc>
@@ -10725,7 +11148,7 @@
           <w:color w:val="000000"/>
           <w:u w:val="none"/>
         </w:rPr>
-        <w:t>12.4. Mock-почта</w:t>
+        <w:t>13.4. Mock-почта</w:t>
       </w:r>
     </w:p>
     <w:p>
@@ -10987,7 +11410,7 @@
           <w:color w:val="000000"/>
           <w:u w:val="none"/>
         </w:rPr>
-        <w:t>12.5. Сессия</w:t>
+        <w:t>13.5. Сессия</w:t>
       </w:r>
     </w:p>
     <w:p>
@@ -11351,7 +11774,7 @@
           <w:color w:val="000000"/>
           <w:u w:val="none"/>
         </w:rPr>
-        <w:t>12.6. Профиль</w:t>
+        <w:t>13.6. Профиль</w:t>
       </w:r>
     </w:p>
     <w:p>
@@ -11817,7 +12240,7 @@
           <w:color w:val="000000"/>
           <w:u w:val="none"/>
         </w:rPr>
-        <w:t>12.7. Приватность</w:t>
+        <w:t>13.7. Приватность</w:t>
       </w:r>
     </w:p>
     <w:p>
@@ -12181,7 +12604,7 @@
           <w:color w:val="000000"/>
           <w:u w:val="none"/>
         </w:rPr>
-        <w:t>12.8. Оценка</w:t>
+        <w:t>13.8. Оценка</w:t>
       </w:r>
     </w:p>
     <w:p>
@@ -12647,7 +13070,7 @@
           <w:color w:val="000000"/>
           <w:u w:val="none"/>
         </w:rPr>
-        <w:t>12.9. Демо-оценка</w:t>
+        <w:t>13.9. Демо-оценка</w:t>
       </w:r>
     </w:p>
     <w:p>
@@ -13215,7 +13638,7 @@
           <w:color w:val="000000"/>
           <w:u w:val="none"/>
         </w:rPr>
-        <w:t>12.10. ФСП ID mock</w:t>
+        <w:t>13.10. ФСП ID mock</w:t>
       </w:r>
     </w:p>
     <w:p>
@@ -14098,7 +14521,7 @@
           <w:color w:val="000000"/>
           <w:u w:val="none"/>
         </w:rPr>
-        <w:t>12.11. Подбор</w:t>
+        <w:t>13.11. Подбор</w:t>
       </w:r>
     </w:p>
     <w:p>
@@ -15278,7 +15701,7 @@
           <w:color w:val="000000"/>
           <w:u w:val="none"/>
         </w:rPr>
-        <w:t>12.12. Приглашения</w:t>
+        <w:t>13.12. Приглашения</w:t>
       </w:r>
     </w:p>
     <w:p>
@@ -16050,7 +16473,7 @@
           <w:color w:val="000000"/>
           <w:u w:val="none"/>
         </w:rPr>
-        <w:t>12.13. Сообщения</w:t>
+        <w:t>13.13. Сообщения</w:t>
       </w:r>
     </w:p>
     <w:p>
@@ -17052,7 +17475,7 @@
           <w:color w:val="000000"/>
           <w:u w:val="none"/>
         </w:rPr>
-        <w:t>12.14. Экспорт</w:t>
+        <w:t>13.14. Экспорт</w:t>
       </w:r>
     </w:p>
     <w:p>
@@ -17416,7 +17839,7 @@
           <w:color w:val="000000"/>
           <w:u w:val="none"/>
         </w:rPr>
-        <w:t>12.15. Справочники</w:t>
+        <w:t>13.15. Справочники</w:t>
       </w:r>
     </w:p>
     <w:p>
@@ -17678,7 +18101,7 @@
           <w:color w:val="000000"/>
           <w:u w:val="none"/>
         </w:rPr>
-        <w:t>12.16. Компания</w:t>
+        <w:t>13.16. Компания</w:t>
       </w:r>
     </w:p>
     <w:p>
@@ -18042,7 +18465,7 @@
           <w:color w:val="000000"/>
           <w:u w:val="none"/>
         </w:rPr>
-        <w:t>12.17. Потребности</w:t>
+        <w:t>13.17. Потребности</w:t>
       </w:r>
     </w:p>
     <w:p>
@@ -18406,7 +18829,7 @@
           <w:color w:val="000000"/>
           <w:u w:val="none"/>
         </w:rPr>
-        <w:t>12.18. Вакансии</w:t>
+        <w:t>13.18. Вакансии</w:t>
       </w:r>
     </w:p>
     <w:p>
@@ -18974,7 +19397,7 @@
           <w:color w:val="000000"/>
           <w:u w:val="none"/>
         </w:rPr>
-        <w:t>12.19. Отклики</w:t>
+        <w:t>13.19. Отклики</w:t>
       </w:r>
     </w:p>
     <w:p>
@@ -19644,7 +20067,7 @@
           <w:color w:val="000000"/>
           <w:u w:val="none"/>
         </w:rPr>
-        <w:t>12.20. Короткие задания</w:t>
+        <w:t>13.20. Короткие задания</w:t>
       </w:r>
     </w:p>
     <w:p>
@@ -20416,7 +20839,7 @@
           <w:color w:val="000000"/>
           <w:u w:val="none"/>
         </w:rPr>
-        <w:t>12.21. Конструктор</w:t>
+        <w:t>13.21. Конструктор</w:t>
       </w:r>
     </w:p>
     <w:p>
@@ -21494,7 +21917,7 @@
           <w:color w:val="000000"/>
           <w:u w:val="none"/>
         </w:rPr>
-        <w:t>12.22. Импорт заданий</w:t>
+        <w:t>13.22. Импорт заданий</w:t>
       </w:r>
     </w:p>
     <w:p>
@@ -21960,7 +22383,7 @@
           <w:color w:val="000000"/>
           <w:u w:val="none"/>
         </w:rPr>
-        <w:t>12.23. Выполнение заданий</w:t>
+        <w:t>13.23. Выполнение заданий</w:t>
       </w:r>
     </w:p>
     <w:p>
@@ -22732,7 +23155,7 @@
           <w:color w:val="000000"/>
           <w:u w:val="none"/>
         </w:rPr>
-        <w:t>12.24. Выполнение кода</w:t>
+        <w:t>13.24. Выполнение кода</w:t>
       </w:r>
     </w:p>
     <w:p>
@@ -23096,7 +23519,7 @@
           <w:color w:val="000000"/>
           <w:u w:val="none"/>
         </w:rPr>
-        <w:t>12.25. Ручная проверка</w:t>
+        <w:t>13.25. Ручная проверка</w:t>
       </w:r>
     </w:p>
     <w:p>
@@ -23562,7 +23985,7 @@
           <w:color w:val="000000"/>
           <w:u w:val="none"/>
         </w:rPr>
-        <w:t>12.26. Внутренний runner</w:t>
+        <w:t>13.26. Внутренний runner</w:t>
       </w:r>
     </w:p>
     <w:p>
@@ -23926,7 +24349,7 @@
           <w:color w:val="000000"/>
           <w:u w:val="none"/>
         </w:rPr>
-        <w:t>13. Историческая проверка руководства (72 пути / 82 операции)</w:t>
+        <w:t>14. Историческая проверка руководства (72 пути / 82 операции)</w:t>
       </w:r>
     </w:p>
     <w:p>
@@ -24093,7 +24516,7 @@
           <w:color w:val="000000"/>
           <w:u w:val="none"/>
         </w:rPr>
-        <w:t>14. Иллюстрация пользовательского контроля доступа</w:t>
+        <w:t>15. Иллюстрация пользовательского контроля доступа</w:t>
       </w:r>
     </w:p>
     <w:p>

</xml_diff>